<commit_message>
show movie , choose move , show theater, now working seat booking
</commit_message>
<xml_diff>
--- a/Perfect Mongo Db Design With Admin Ownership.docx
+++ b/Perfect Mongo Db Design With Admin Ownership.docx
@@ -1,14 +1,14 @@
 
 <file path=word/document.xml><?xml version="1.0" encoding="utf-8"?>
-<w:document xmlns:w="http://schemas.openxmlformats.org/wordprocessingml/2006/main" xmlns:m="http://schemas.openxmlformats.org/officeDocument/2006/math" xmlns:r="http://schemas.openxmlformats.org/officeDocument/2006/relationships" xmlns:o="urn:schemas-microsoft-com:office:office" xmlns:v="urn:schemas-microsoft-com:vml" xmlns:w10="urn:schemas-microsoft-com:office:word" xmlns:a="http://schemas.openxmlformats.org/drawingml/2006/main" xmlns:pic="http://schemas.openxmlformats.org/drawingml/2006/picture" xmlns:wp="http://schemas.openxmlformats.org/drawingml/2006/wordprocessingDrawing">
+<w:document xmlns:wpc="http://schemas.microsoft.com/office/word/2010/wordprocessingCanvas" xmlns:cx="http://schemas.microsoft.com/office/drawing/2014/chartex" xmlns:cx1="http://schemas.microsoft.com/office/drawing/2015/9/8/chartex" xmlns:cx2="http://schemas.microsoft.com/office/drawing/2015/10/21/chartex" xmlns:cx3="http://schemas.microsoft.com/office/drawing/2016/5/9/chartex" xmlns:cx4="http://schemas.microsoft.com/office/drawing/2016/5/10/chartex" xmlns:cx5="http://schemas.microsoft.com/office/drawing/2016/5/11/chartex" xmlns:cx6="http://schemas.microsoft.com/office/drawing/2016/5/12/chartex" xmlns:cx7="http://schemas.microsoft.com/office/drawing/2016/5/13/chartex" xmlns:cx8="http://schemas.microsoft.com/office/drawing/2016/5/14/chartex" xmlns:mc="http://schemas.openxmlformats.org/markup-compatibility/2006" xmlns:aink="http://schemas.microsoft.com/office/drawing/2016/ink" xmlns:am3d="http://schemas.microsoft.com/office/drawing/2017/model3d" xmlns:o="urn:schemas-microsoft-com:office:office" xmlns:oel="http://schemas.microsoft.com/office/2019/extlst" xmlns:r="http://schemas.openxmlformats.org/officeDocument/2006/relationships" xmlns:m="http://schemas.openxmlformats.org/officeDocument/2006/math" xmlns:v="urn:schemas-microsoft-com:vml" xmlns:wp14="http://schemas.microsoft.com/office/word/2010/wordprocessingDrawing" xmlns:wp="http://schemas.openxmlformats.org/drawingml/2006/wordprocessingDrawing" xmlns:w10="urn:schemas-microsoft-com:office:word" xmlns:w="http://schemas.openxmlformats.org/wordprocessingml/2006/main" xmlns:w14="http://schemas.microsoft.com/office/word/2010/wordml" xmlns:w15="http://schemas.microsoft.com/office/word/2012/wordml" xmlns:w16cex="http://schemas.microsoft.com/office/word/2018/wordml/cex" xmlns:w16cid="http://schemas.microsoft.com/office/word/2016/wordml/cid" xmlns:w16="http://schemas.microsoft.com/office/word/2018/wordml" xmlns:w16du="http://schemas.microsoft.com/office/word/2023/wordml/word16du" xmlns:w16sdtdh="http://schemas.microsoft.com/office/word/2020/wordml/sdtdatahash" xmlns:w16sdtfl="http://schemas.microsoft.com/office/word/2024/wordml/sdtformatlock" xmlns:w16se="http://schemas.microsoft.com/office/word/2015/wordml/symex" xmlns:wpg="http://schemas.microsoft.com/office/word/2010/wordprocessingGroup" xmlns:wpi="http://schemas.microsoft.com/office/word/2010/wordprocessingInk" xmlns:wne="http://schemas.microsoft.com/office/word/2006/wordml" xmlns:wps="http://schemas.microsoft.com/office/word/2010/wordprocessingShape" mc:Ignorable="w14 w15 w16se w16cid w16 w16cex w16sdtdh w16sdtfl w16du wp14">
   <w:body>
-    <w:bookmarkStart w:id="21" w:name="X5660b6e3235a3ca9681d4283ab6b312a21d262a"/>
     <w:p>
       <w:pPr>
         <w:pStyle w:val="Heading1"/>
       </w:pPr>
-      <w:r>
-        <w:t xml:space="preserve">✅ Perfect MongoDB Database Design (Admin Ownership Included)</w:t>
+      <w:bookmarkStart w:id="0" w:name="X5660b6e3235a3ca9681d4283ab6b312a21d262a"/>
+      <w:r>
+        <w:t>✅ Perfect MongoDB Database Design (Admin Ownership Included)</w:t>
       </w:r>
     </w:p>
     <w:p>
@@ -16,41 +16,17 @@
         <w:pStyle w:val="FirstParagraph"/>
       </w:pPr>
       <w:r>
-        <w:t xml:space="preserve">Yes ✅ —</w:t>
-      </w:r>
-      <w:r>
-        <w:t xml:space="preserve"> </w:t>
+        <w:t xml:space="preserve">Yes ✅ — </w:t>
       </w:r>
       <w:r>
         <w:rPr>
           <w:b/>
           <w:bCs/>
         </w:rPr>
-        <w:t xml:space="preserve">If Admin creates Movie, Theater, Show, Booking, Payment, Review, Notification, or Report, then Admin ID must be stored.</w:t>
-      </w:r>
-      <w:r>
-        <w:t xml:space="preserve"> </w:t>
-      </w:r>
-      <w:r>
-        <w:t xml:space="preserve">This is very important for:</w:t>
-      </w:r>
-      <w:r>
-        <w:t xml:space="preserve"> </w:t>
-      </w:r>
-      <w:r>
-        <w:t xml:space="preserve">- Audit tracking</w:t>
-      </w:r>
-      <w:r>
-        <w:t xml:space="preserve"> </w:t>
-      </w:r>
-      <w:r>
-        <w:t xml:space="preserve">- RBAC (Role Based Access Control)</w:t>
-      </w:r>
-      <w:r>
-        <w:t xml:space="preserve"> </w:t>
-      </w:r>
-      <w:r>
-        <w:t xml:space="preserve">- Security &amp; responsibility</w:t>
+        <w:t>If Admin creates Movie, Theater, Show, Booking, Payment, Review, Notification, or Report, then Admin ID must be stored.</w:t>
+      </w:r>
+      <w:r>
+        <w:t xml:space="preserve"> This is very important for: - Audit tracking - RBAC (Role Based Access Control) - Security &amp; responsibility</w:t>
       </w:r>
     </w:p>
     <w:p>
@@ -58,7 +34,7 @@
         <w:pStyle w:val="BodyText"/>
       </w:pPr>
       <w:r>
-        <w:t xml:space="preserve">So we introduce a common field in Admin-controlled collections:</w:t>
+        <w:t>So we introduce a common field in Admin-controlled collections:</w:t>
       </w:r>
     </w:p>
     <w:p>
@@ -70,29 +46,26 @@
           <w:b/>
           <w:bCs/>
         </w:rPr>
-        <w:t xml:space="preserve">createdBy (adminId)</w:t>
-      </w:r>
-      <w:r>
-        <w:t xml:space="preserve"> </w:t>
-      </w:r>
-      <w:r>
-        <w:t xml:space="preserve">→ Reference to User who is admin</w:t>
-      </w:r>
-    </w:p>
-    <w:p>
-      <w:r>
-        <w:pict>
-          <v:rect style="width:0;height:1.5pt" o:hralign="center" o:hrstd="t" o:hr="t"/>
+        <w:t>createdBy (adminId)</w:t>
+      </w:r>
+      <w:r>
+        <w:t xml:space="preserve"> → Reference to User who is admin</w:t>
+      </w:r>
+    </w:p>
+    <w:p>
+      <w:r>
+        <w:pict w14:anchorId="29F00446">
+          <v:rect id="_x0000_i1025" style="width:0;height:1.5pt" o:hralign="center" o:hrstd="t" o:hr="t"/>
         </w:pict>
       </w:r>
     </w:p>
-    <w:bookmarkStart w:id="20" w:name="core-rule"/>
     <w:p>
       <w:pPr>
         <w:pStyle w:val="Heading2"/>
       </w:pPr>
-      <w:r>
-        <w:t xml:space="preserve">🔷 Core Rule</w:t>
+      <w:bookmarkStart w:id="1" w:name="core-rule"/>
+      <w:r>
+        <w:t>🔷 Core Rule</w:t>
       </w:r>
     </w:p>
     <w:p>
@@ -100,7 +73,7 @@
         <w:pStyle w:val="FirstParagraph"/>
       </w:pPr>
       <w:r>
-        <w:t xml:space="preserve">Every entity created by Admin will include:</w:t>
+        <w:t>Every entity created by Admin will include:</w:t>
       </w:r>
     </w:p>
     <w:p>
@@ -111,43 +84,43 @@
         <w:rPr>
           <w:rStyle w:val="VerbatimChar"/>
         </w:rPr>
-        <w:t xml:space="preserve">createdBy: ObjectId (ref: users) // Must be role = admin</w:t>
-      </w:r>
-      <w:r>
-        <w:br/>
-      </w:r>
-      <w:r>
-        <w:rPr>
-          <w:rStyle w:val="VerbatimChar"/>
-        </w:rPr>
-        <w:t xml:space="preserve">updatedBy: ObjectId (ref: users) // optional but recommended</w:t>
-      </w:r>
-    </w:p>
-    <w:p>
-      <w:r>
-        <w:pict>
-          <v:rect style="width:0;height:1.5pt" o:hralign="center" o:hrstd="t" o:hr="t"/>
+        <w:t>createdBy: ObjectId (ref: users) // Must be role = admin</w:t>
+      </w:r>
+      <w:r>
+        <w:br/>
+      </w:r>
+      <w:r>
+        <w:rPr>
+          <w:rStyle w:val="VerbatimChar"/>
+        </w:rPr>
+        <w:t>updatedBy: ObjectId (ref: users) // optional but recommended</w:t>
+      </w:r>
+    </w:p>
+    <w:p>
+      <w:r>
+        <w:pict w14:anchorId="77E0CC64">
+          <v:rect id="_x0000_i1026" style="width:0;height:1.5pt" o:hralign="center" o:hrstd="t" o:hr="t"/>
         </w:pict>
       </w:r>
     </w:p>
-    <w:bookmarkEnd w:id="20"/>
-    <w:bookmarkEnd w:id="21"/>
-    <w:bookmarkStart w:id="31" w:name="final-optimized-collections-structure"/>
     <w:p>
       <w:pPr>
         <w:pStyle w:val="Heading1"/>
       </w:pPr>
-      <w:r>
-        <w:t xml:space="preserve">✅ Final Optimized Collections Structure</w:t>
-      </w:r>
-    </w:p>
-    <w:bookmarkStart w:id="22" w:name="users"/>
+      <w:bookmarkStart w:id="2" w:name="final-optimized-collections-structure"/>
+      <w:bookmarkEnd w:id="0"/>
+      <w:bookmarkEnd w:id="1"/>
+      <w:r>
+        <w:t>✅ Final Optimized Collections Structure</w:t>
+      </w:r>
+    </w:p>
     <w:p>
       <w:pPr>
         <w:pStyle w:val="Heading2"/>
       </w:pPr>
-      <w:r>
-        <w:t xml:space="preserve">1. users</w:t>
+      <w:bookmarkStart w:id="3" w:name="users"/>
+      <w:r>
+        <w:t>1. users</w:t>
       </w:r>
     </w:p>
     <w:p>
@@ -155,7 +128,7 @@
         <w:pStyle w:val="FirstParagraph"/>
       </w:pPr>
       <w:r>
-        <w:t xml:space="preserve">Stores both users and admins</w:t>
+        <w:t>Stores both users and admins</w:t>
       </w:r>
     </w:p>
     <w:p>
@@ -166,7 +139,7 @@
         <w:rPr>
           <w:rStyle w:val="VerbatimChar"/>
         </w:rPr>
-        <w:t xml:space="preserve">{</w:t>
+        <w:t>{</w:t>
       </w:r>
       <w:r>
         <w:br/>
@@ -247,24 +220,24 @@
         <w:rPr>
           <w:rStyle w:val="VerbatimChar"/>
         </w:rPr>
-        <w:t xml:space="preserve">}</w:t>
-      </w:r>
-    </w:p>
-    <w:p>
-      <w:r>
-        <w:pict>
-          <v:rect style="width:0;height:1.5pt" o:hralign="center" o:hrstd="t" o:hr="t"/>
+        <w:t>}</w:t>
+      </w:r>
+    </w:p>
+    <w:p>
+      <w:r>
+        <w:pict w14:anchorId="060E05CD">
+          <v:rect id="_x0000_i1027" style="width:0;height:1.5pt" o:hralign="center" o:hrstd="t" o:hr="t"/>
         </w:pict>
       </w:r>
     </w:p>
-    <w:bookmarkEnd w:id="22"/>
-    <w:bookmarkStart w:id="23" w:name="movies"/>
     <w:p>
       <w:pPr>
         <w:pStyle w:val="Heading2"/>
       </w:pPr>
-      <w:r>
-        <w:t xml:space="preserve">2. movies</w:t>
+      <w:bookmarkStart w:id="4" w:name="movies"/>
+      <w:bookmarkEnd w:id="3"/>
+      <w:r>
+        <w:t>2. movies</w:t>
       </w:r>
     </w:p>
     <w:p>
@@ -272,7 +245,7 @@
         <w:pStyle w:val="FirstParagraph"/>
       </w:pPr>
       <w:r>
-        <w:t xml:space="preserve">(Admin created)</w:t>
+        <w:t>(Admin created)</w:t>
       </w:r>
     </w:p>
     <w:p>
@@ -283,7 +256,7 @@
         <w:rPr>
           <w:rStyle w:val="VerbatimChar"/>
         </w:rPr>
-        <w:t xml:space="preserve">{</w:t>
+        <w:t>{</w:t>
       </w:r>
       <w:r>
         <w:br/>
@@ -382,6 +355,7 @@
         <w:rPr>
           <w:rStyle w:val="VerbatimChar"/>
         </w:rPr>
+        <w:lastRenderedPageBreak/>
         <w:t xml:space="preserve">  rating: Number,</w:t>
       </w:r>
       <w:r>
@@ -439,24 +413,24 @@
         <w:rPr>
           <w:rStyle w:val="VerbatimChar"/>
         </w:rPr>
-        <w:t xml:space="preserve">}</w:t>
-      </w:r>
-    </w:p>
-    <w:p>
-      <w:r>
-        <w:pict>
-          <v:rect style="width:0;height:1.5pt" o:hralign="center" o:hrstd="t" o:hr="t"/>
+        <w:t>}</w:t>
+      </w:r>
+    </w:p>
+    <w:p>
+      <w:r>
+        <w:pict w14:anchorId="63014B7C">
+          <v:rect id="_x0000_i1028" style="width:0;height:1.5pt" o:hralign="center" o:hrstd="t" o:hr="t"/>
         </w:pict>
       </w:r>
     </w:p>
-    <w:bookmarkEnd w:id="23"/>
-    <w:bookmarkStart w:id="24" w:name="theaters"/>
     <w:p>
       <w:pPr>
         <w:pStyle w:val="Heading2"/>
       </w:pPr>
-      <w:r>
-        <w:t xml:space="preserve">3. theaters</w:t>
+      <w:bookmarkStart w:id="5" w:name="theaters"/>
+      <w:bookmarkEnd w:id="4"/>
+      <w:r>
+        <w:t>3. theaters</w:t>
       </w:r>
     </w:p>
     <w:p>
@@ -464,7 +438,7 @@
         <w:pStyle w:val="FirstParagraph"/>
       </w:pPr>
       <w:r>
-        <w:t xml:space="preserve">(Admin created)</w:t>
+        <w:t>(Admin created)</w:t>
       </w:r>
     </w:p>
     <w:p>
@@ -475,7 +449,7 @@
         <w:rPr>
           <w:rStyle w:val="VerbatimChar"/>
         </w:rPr>
-        <w:t xml:space="preserve">{</w:t>
+        <w:t>{</w:t>
       </w:r>
       <w:r>
         <w:br/>
@@ -577,24 +551,24 @@
         <w:rPr>
           <w:rStyle w:val="VerbatimChar"/>
         </w:rPr>
-        <w:t xml:space="preserve">}</w:t>
-      </w:r>
-    </w:p>
-    <w:p>
-      <w:r>
-        <w:pict>
-          <v:rect style="width:0;height:1.5pt" o:hralign="center" o:hrstd="t" o:hr="t"/>
+        <w:t>}</w:t>
+      </w:r>
+    </w:p>
+    <w:p>
+      <w:r>
+        <w:pict w14:anchorId="43B9AEDC">
+          <v:rect id="_x0000_i1029" style="width:0;height:1.5pt" o:hralign="center" o:hrstd="t" o:hr="t"/>
         </w:pict>
       </w:r>
     </w:p>
-    <w:bookmarkEnd w:id="24"/>
-    <w:bookmarkStart w:id="25" w:name="shows"/>
     <w:p>
       <w:pPr>
         <w:pStyle w:val="Heading2"/>
       </w:pPr>
-      <w:r>
-        <w:t xml:space="preserve">4. shows</w:t>
+      <w:bookmarkStart w:id="6" w:name="shows"/>
+      <w:bookmarkEnd w:id="5"/>
+      <w:r>
+        <w:t>4. shows</w:t>
       </w:r>
     </w:p>
     <w:p>
@@ -602,7 +576,7 @@
         <w:pStyle w:val="FirstParagraph"/>
       </w:pPr>
       <w:r>
-        <w:t xml:space="preserve">(Admin created)</w:t>
+        <w:t>(Admin created)</w:t>
       </w:r>
     </w:p>
     <w:p>
@@ -613,7 +587,7 @@
         <w:rPr>
           <w:rStyle w:val="VerbatimChar"/>
         </w:rPr>
-        <w:t xml:space="preserve">{</w:t>
+        <w:t>{</w:t>
       </w:r>
       <w:r>
         <w:br/>
@@ -733,24 +707,24 @@
         <w:rPr>
           <w:rStyle w:val="VerbatimChar"/>
         </w:rPr>
-        <w:t xml:space="preserve">}</w:t>
-      </w:r>
-    </w:p>
-    <w:p>
-      <w:r>
-        <w:pict>
-          <v:rect style="width:0;height:1.5pt" o:hralign="center" o:hrstd="t" o:hr="t"/>
+        <w:t>}</w:t>
+      </w:r>
+    </w:p>
+    <w:p>
+      <w:r>
+        <w:pict w14:anchorId="45760D75">
+          <v:rect id="_x0000_i1030" style="width:0;height:1.5pt" o:hralign="center" o:hrstd="t" o:hr="t"/>
         </w:pict>
       </w:r>
     </w:p>
-    <w:bookmarkEnd w:id="25"/>
-    <w:bookmarkStart w:id="26" w:name="bookings"/>
     <w:p>
       <w:pPr>
         <w:pStyle w:val="Heading2"/>
       </w:pPr>
-      <w:r>
-        <w:t xml:space="preserve">5. bookings</w:t>
+      <w:bookmarkStart w:id="7" w:name="bookings"/>
+      <w:bookmarkEnd w:id="6"/>
+      <w:r>
+        <w:t>5. bookings</w:t>
       </w:r>
     </w:p>
     <w:p>
@@ -758,7 +732,7 @@
         <w:pStyle w:val="FirstParagraph"/>
       </w:pPr>
       <w:r>
-        <w:t xml:space="preserve">(Created by User but managed by Admin)</w:t>
+        <w:t>(Created by User but managed by Admin)</w:t>
       </w:r>
     </w:p>
     <w:p>
@@ -769,7 +743,7 @@
         <w:rPr>
           <w:rStyle w:val="VerbatimChar"/>
         </w:rPr>
-        <w:t xml:space="preserve">{</w:t>
+        <w:t>{</w:t>
       </w:r>
       <w:r>
         <w:br/>
@@ -796,6 +770,7 @@
         <w:rPr>
           <w:rStyle w:val="VerbatimChar"/>
         </w:rPr>
+        <w:lastRenderedPageBreak/>
         <w:t xml:space="preserve">  movieId: { type: ObjectId, ref: 'movies' },</w:t>
       </w:r>
       <w:r>
@@ -880,24 +855,24 @@
         <w:rPr>
           <w:rStyle w:val="VerbatimChar"/>
         </w:rPr>
-        <w:t xml:space="preserve">}</w:t>
-      </w:r>
-    </w:p>
-    <w:p>
-      <w:r>
-        <w:pict>
-          <v:rect style="width:0;height:1.5pt" o:hralign="center" o:hrstd="t" o:hr="t"/>
+        <w:t>}</w:t>
+      </w:r>
+    </w:p>
+    <w:p>
+      <w:r>
+        <w:pict w14:anchorId="5CEF0BAE">
+          <v:rect id="_x0000_i1031" style="width:0;height:1.5pt" o:hralign="center" o:hrstd="t" o:hr="t"/>
         </w:pict>
       </w:r>
     </w:p>
-    <w:bookmarkEnd w:id="26"/>
-    <w:bookmarkStart w:id="27" w:name="payments"/>
     <w:p>
       <w:pPr>
         <w:pStyle w:val="Heading2"/>
       </w:pPr>
-      <w:r>
-        <w:t xml:space="preserve">6. payments</w:t>
+      <w:bookmarkStart w:id="8" w:name="payments"/>
+      <w:bookmarkEnd w:id="7"/>
+      <w:r>
+        <w:t>6. payments</w:t>
       </w:r>
     </w:p>
     <w:p>
@@ -905,7 +880,7 @@
         <w:pStyle w:val="FirstParagraph"/>
       </w:pPr>
       <w:r>
-        <w:t xml:space="preserve">(Admin + system controlled)</w:t>
+        <w:t>(Admin + system controlled)</w:t>
       </w:r>
     </w:p>
     <w:p>
@@ -916,7 +891,7 @@
         <w:rPr>
           <w:rStyle w:val="VerbatimChar"/>
         </w:rPr>
-        <w:t xml:space="preserve">{</w:t>
+        <w:t>{</w:t>
       </w:r>
       <w:r>
         <w:br/>
@@ -1009,24 +984,24 @@
         <w:rPr>
           <w:rStyle w:val="VerbatimChar"/>
         </w:rPr>
-        <w:t xml:space="preserve">}</w:t>
-      </w:r>
-    </w:p>
-    <w:p>
-      <w:r>
-        <w:pict>
-          <v:rect style="width:0;height:1.5pt" o:hralign="center" o:hrstd="t" o:hr="t"/>
+        <w:t>}</w:t>
+      </w:r>
+    </w:p>
+    <w:p>
+      <w:r>
+        <w:pict w14:anchorId="59A00BAB">
+          <v:rect id="_x0000_i1032" style="width:0;height:1.5pt" o:hralign="center" o:hrstd="t" o:hr="t"/>
         </w:pict>
       </w:r>
     </w:p>
-    <w:bookmarkEnd w:id="27"/>
-    <w:bookmarkStart w:id="28" w:name="reviews"/>
     <w:p>
       <w:pPr>
         <w:pStyle w:val="Heading2"/>
       </w:pPr>
-      <w:r>
-        <w:t xml:space="preserve">7. reviews</w:t>
+      <w:bookmarkStart w:id="9" w:name="reviews"/>
+      <w:bookmarkEnd w:id="8"/>
+      <w:r>
+        <w:t>7. reviews</w:t>
       </w:r>
     </w:p>
     <w:p>
@@ -1034,7 +1009,7 @@
         <w:pStyle w:val="FirstParagraph"/>
       </w:pPr>
       <w:r>
-        <w:t xml:space="preserve">(User created)</w:t>
+        <w:t>(User created)</w:t>
       </w:r>
     </w:p>
     <w:p>
@@ -1045,7 +1020,7 @@
         <w:rPr>
           <w:rStyle w:val="VerbatimChar"/>
         </w:rPr>
-        <w:t xml:space="preserve">{</w:t>
+        <w:t>{</w:t>
       </w:r>
       <w:r>
         <w:br/>
@@ -1108,24 +1083,24 @@
         <w:rPr>
           <w:rStyle w:val="VerbatimChar"/>
         </w:rPr>
-        <w:t xml:space="preserve">}</w:t>
-      </w:r>
-    </w:p>
-    <w:p>
-      <w:r>
-        <w:pict>
-          <v:rect style="width:0;height:1.5pt" o:hralign="center" o:hrstd="t" o:hr="t"/>
+        <w:t>}</w:t>
+      </w:r>
+    </w:p>
+    <w:p>
+      <w:r>
+        <w:pict w14:anchorId="6BEC89D1">
+          <v:rect id="_x0000_i1033" style="width:0;height:1.5pt" o:hralign="center" o:hrstd="t" o:hr="t"/>
         </w:pict>
       </w:r>
     </w:p>
-    <w:bookmarkEnd w:id="28"/>
-    <w:bookmarkStart w:id="29" w:name="notifications"/>
     <w:p>
       <w:pPr>
         <w:pStyle w:val="Heading2"/>
       </w:pPr>
-      <w:r>
-        <w:t xml:space="preserve">8. notifications</w:t>
+      <w:bookmarkStart w:id="10" w:name="notifications"/>
+      <w:bookmarkEnd w:id="9"/>
+      <w:r>
+        <w:t>8. notifications</w:t>
       </w:r>
     </w:p>
     <w:p>
@@ -1133,7 +1108,7 @@
         <w:pStyle w:val="FirstParagraph"/>
       </w:pPr>
       <w:r>
-        <w:t xml:space="preserve">(System/Admin created)</w:t>
+        <w:t>(System/Admin created)</w:t>
       </w:r>
     </w:p>
     <w:p>
@@ -1144,7 +1119,7 @@
         <w:rPr>
           <w:rStyle w:val="VerbatimChar"/>
         </w:rPr>
-        <w:t xml:space="preserve">{</w:t>
+        <w:t>{</w:t>
       </w:r>
       <w:r>
         <w:br/>
@@ -1210,6 +1185,7 @@
         <w:rPr>
           <w:rStyle w:val="VerbatimChar"/>
         </w:rPr>
+        <w:lastRenderedPageBreak/>
         <w:t xml:space="preserve">  createdAt: Date</w:t>
       </w:r>
       <w:r>
@@ -1219,24 +1195,24 @@
         <w:rPr>
           <w:rStyle w:val="VerbatimChar"/>
         </w:rPr>
-        <w:t xml:space="preserve">}</w:t>
-      </w:r>
-    </w:p>
-    <w:p>
-      <w:r>
-        <w:pict>
-          <v:rect style="width:0;height:1.5pt" o:hralign="center" o:hrstd="t" o:hr="t"/>
+        <w:t>}</w:t>
+      </w:r>
+    </w:p>
+    <w:p>
+      <w:r>
+        <w:pict w14:anchorId="6C7009F0">
+          <v:rect id="_x0000_i1034" style="width:0;height:1.5pt" o:hralign="center" o:hrstd="t" o:hr="t"/>
         </w:pict>
       </w:r>
     </w:p>
-    <w:bookmarkEnd w:id="29"/>
-    <w:bookmarkStart w:id="30" w:name="adminreports"/>
     <w:p>
       <w:pPr>
         <w:pStyle w:val="Heading2"/>
       </w:pPr>
-      <w:r>
-        <w:t xml:space="preserve">9. adminReports</w:t>
+      <w:bookmarkStart w:id="11" w:name="adminreports"/>
+      <w:bookmarkEnd w:id="10"/>
+      <w:r>
+        <w:t>9. adminReports</w:t>
       </w:r>
     </w:p>
     <w:p>
@@ -1244,7 +1220,7 @@
         <w:pStyle w:val="FirstParagraph"/>
       </w:pPr>
       <w:r>
-        <w:t xml:space="preserve">(Admin created)</w:t>
+        <w:t>(Admin created)</w:t>
       </w:r>
     </w:p>
     <w:p>
@@ -1255,7 +1231,7 @@
         <w:rPr>
           <w:rStyle w:val="VerbatimChar"/>
         </w:rPr>
-        <w:t xml:space="preserve">{</w:t>
+        <w:t>{</w:t>
       </w:r>
       <w:r>
         <w:br/>
@@ -1330,228 +1306,261 @@
         <w:rPr>
           <w:rStyle w:val="VerbatimChar"/>
         </w:rPr>
-        <w:t xml:space="preserve">}</w:t>
-      </w:r>
-    </w:p>
-    <w:p>
-      <w:r>
-        <w:pict>
-          <v:rect style="width:0;height:1.5pt" o:hralign="center" o:hrstd="t" o:hr="t"/>
+        <w:t>}</w:t>
+      </w:r>
+    </w:p>
+    <w:p>
+      <w:r>
+        <w:pict w14:anchorId="213A3580">
+          <v:rect id="_x0000_i1035" style="width:0;height:1.5pt" o:hralign="center" o:hrstd="t" o:hr="t"/>
         </w:pict>
       </w:r>
     </w:p>
-    <w:bookmarkEnd w:id="30"/>
-    <w:bookmarkEnd w:id="31"/>
-    <w:bookmarkStart w:id="32" w:name="summary"/>
     <w:p>
       <w:pPr>
         <w:pStyle w:val="Heading1"/>
       </w:pPr>
-      <w:r>
-        <w:t xml:space="preserve">✅ Summary</w:t>
+      <w:bookmarkStart w:id="12" w:name="summary"/>
+      <w:bookmarkEnd w:id="2"/>
+      <w:bookmarkEnd w:id="11"/>
+      <w:r>
+        <w:t>✅ Summary</w:t>
       </w:r>
     </w:p>
     <w:tbl>
       <w:tblPr>
         <w:tblStyle w:val="Table"/>
-        <w:tblW w:type="auto" w:w="0"/>
-        <w:tblLook w:firstRow="1" w:lastRow="0" w:firstColumn="0" w:lastColumn="0" w:noHBand="0" w:noVBand="0" w:val="0020"/>
+        <w:tblW w:w="0" w:type="auto"/>
+        <w:tblLook w:val="0020" w:firstRow="1" w:lastRow="0" w:firstColumn="0" w:lastColumn="0" w:noHBand="0" w:noVBand="0"/>
       </w:tblPr>
       <w:tblGrid>
-        <w:gridCol w:w="3960"/>
-        <w:gridCol w:w="3960"/>
+        <w:gridCol w:w="1686"/>
+        <w:gridCol w:w="2150"/>
       </w:tblGrid>
       <w:tr>
         <w:trPr>
-          <w:tblHeader w:val="on"/>
+          <w:cnfStyle w:val="100000000000" w:firstRow="1" w:lastRow="0" w:firstColumn="0" w:lastColumn="0" w:oddVBand="0" w:evenVBand="0" w:oddHBand="0" w:evenHBand="0" w:firstRowFirstColumn="0" w:firstRowLastColumn="0" w:lastRowFirstColumn="0" w:lastRowLastColumn="0"/>
+          <w:tblHeader/>
         </w:trPr>
         <w:tc>
-          <w:tcPr/>
+          <w:tcPr>
+            <w:tcW w:w="0" w:type="auto"/>
+          </w:tcPr>
           <w:p>
             <w:pPr>
               <w:pStyle w:val="Compact"/>
             </w:pPr>
             <w:r>
-              <w:t xml:space="preserve">Collection</w:t>
+              <w:t>Collection</w:t>
             </w:r>
           </w:p>
         </w:tc>
         <w:tc>
-          <w:tcPr/>
+          <w:tcPr>
+            <w:tcW w:w="0" w:type="auto"/>
+          </w:tcPr>
           <w:p>
             <w:pPr>
               <w:pStyle w:val="Compact"/>
             </w:pPr>
             <w:r>
-              <w:t xml:space="preserve">Admin ID Required</w:t>
+              <w:t>Admin ID Required</w:t>
             </w:r>
           </w:p>
         </w:tc>
       </w:tr>
       <w:tr>
         <w:tc>
-          <w:tcPr/>
+          <w:tcPr>
+            <w:tcW w:w="0" w:type="auto"/>
+          </w:tcPr>
           <w:p>
             <w:pPr>
               <w:pStyle w:val="Compact"/>
             </w:pPr>
             <w:r>
-              <w:t xml:space="preserve">movies</w:t>
+              <w:t>movies</w:t>
             </w:r>
           </w:p>
         </w:tc>
         <w:tc>
-          <w:tcPr/>
+          <w:tcPr>
+            <w:tcW w:w="0" w:type="auto"/>
+          </w:tcPr>
           <w:p>
             <w:pPr>
               <w:pStyle w:val="Compact"/>
             </w:pPr>
             <w:r>
-              <w:t xml:space="preserve">✅ createdBy</w:t>
+              <w:t>✅ createdBy</w:t>
             </w:r>
           </w:p>
         </w:tc>
       </w:tr>
       <w:tr>
         <w:tc>
-          <w:tcPr/>
+          <w:tcPr>
+            <w:tcW w:w="0" w:type="auto"/>
+          </w:tcPr>
           <w:p>
             <w:pPr>
               <w:pStyle w:val="Compact"/>
             </w:pPr>
             <w:r>
-              <w:t xml:space="preserve">theaters</w:t>
+              <w:t>theaters</w:t>
             </w:r>
           </w:p>
         </w:tc>
         <w:tc>
-          <w:tcPr/>
+          <w:tcPr>
+            <w:tcW w:w="0" w:type="auto"/>
+          </w:tcPr>
           <w:p>
             <w:pPr>
               <w:pStyle w:val="Compact"/>
             </w:pPr>
             <w:r>
-              <w:t xml:space="preserve">✅ createdBy</w:t>
+              <w:t>✅ createdBy</w:t>
             </w:r>
           </w:p>
         </w:tc>
       </w:tr>
       <w:tr>
         <w:tc>
-          <w:tcPr/>
+          <w:tcPr>
+            <w:tcW w:w="0" w:type="auto"/>
+          </w:tcPr>
           <w:p>
             <w:pPr>
               <w:pStyle w:val="Compact"/>
             </w:pPr>
             <w:r>
-              <w:t xml:space="preserve">shows</w:t>
+              <w:t>shows</w:t>
             </w:r>
           </w:p>
         </w:tc>
         <w:tc>
-          <w:tcPr/>
+          <w:tcPr>
+            <w:tcW w:w="0" w:type="auto"/>
+          </w:tcPr>
           <w:p>
             <w:pPr>
               <w:pStyle w:val="Compact"/>
             </w:pPr>
             <w:r>
-              <w:t xml:space="preserve">✅ createdBy</w:t>
+              <w:t>✅ createdBy</w:t>
             </w:r>
           </w:p>
         </w:tc>
       </w:tr>
       <w:tr>
         <w:tc>
-          <w:tcPr/>
+          <w:tcPr>
+            <w:tcW w:w="0" w:type="auto"/>
+          </w:tcPr>
           <w:p>
             <w:pPr>
               <w:pStyle w:val="Compact"/>
             </w:pPr>
             <w:r>
-              <w:t xml:space="preserve">bookings</w:t>
+              <w:t>bookings</w:t>
             </w:r>
           </w:p>
         </w:tc>
         <w:tc>
-          <w:tcPr/>
+          <w:tcPr>
+            <w:tcW w:w="0" w:type="auto"/>
+          </w:tcPr>
           <w:p>
             <w:pPr>
               <w:pStyle w:val="Compact"/>
             </w:pPr>
             <w:r>
-              <w:t xml:space="preserve">✅ approvedBy</w:t>
+              <w:t>✅ approvedBy</w:t>
             </w:r>
           </w:p>
         </w:tc>
       </w:tr>
       <w:tr>
         <w:tc>
-          <w:tcPr/>
+          <w:tcPr>
+            <w:tcW w:w="0" w:type="auto"/>
+          </w:tcPr>
           <w:p>
             <w:pPr>
               <w:pStyle w:val="Compact"/>
             </w:pPr>
             <w:r>
-              <w:t xml:space="preserve">payments</w:t>
+              <w:t>payments</w:t>
             </w:r>
           </w:p>
         </w:tc>
         <w:tc>
-          <w:tcPr/>
+          <w:tcPr>
+            <w:tcW w:w="0" w:type="auto"/>
+          </w:tcPr>
           <w:p>
             <w:pPr>
               <w:pStyle w:val="Compact"/>
             </w:pPr>
             <w:r>
-              <w:t xml:space="preserve">✅ verifiedBy</w:t>
+              <w:t>✅ verifiedBy</w:t>
             </w:r>
           </w:p>
         </w:tc>
       </w:tr>
       <w:tr>
         <w:tc>
-          <w:tcPr/>
+          <w:tcPr>
+            <w:tcW w:w="0" w:type="auto"/>
+          </w:tcPr>
           <w:p>
             <w:pPr>
               <w:pStyle w:val="Compact"/>
             </w:pPr>
             <w:r>
-              <w:t xml:space="preserve">notifications</w:t>
+              <w:t>notifications</w:t>
             </w:r>
           </w:p>
         </w:tc>
         <w:tc>
-          <w:tcPr/>
+          <w:tcPr>
+            <w:tcW w:w="0" w:type="auto"/>
+          </w:tcPr>
           <w:p>
             <w:pPr>
               <w:pStyle w:val="Compact"/>
             </w:pPr>
             <w:r>
-              <w:t xml:space="preserve">✅ createdBy</w:t>
+              <w:t>✅ createdBy</w:t>
             </w:r>
           </w:p>
         </w:tc>
       </w:tr>
       <w:tr>
         <w:tc>
-          <w:tcPr/>
+          <w:tcPr>
+            <w:tcW w:w="0" w:type="auto"/>
+          </w:tcPr>
           <w:p>
             <w:pPr>
               <w:pStyle w:val="Compact"/>
             </w:pPr>
             <w:r>
-              <w:t xml:space="preserve">adminReports</w:t>
+              <w:t>adminReports</w:t>
             </w:r>
           </w:p>
         </w:tc>
         <w:tc>
-          <w:tcPr/>
+          <w:tcPr>
+            <w:tcW w:w="0" w:type="auto"/>
+          </w:tcPr>
           <w:p>
             <w:pPr>
               <w:pStyle w:val="Compact"/>
             </w:pPr>
             <w:r>
-              <w:t xml:space="preserve">✅ generatedBy</w:t>
+              <w:t>✅ generatedBy</w:t>
             </w:r>
           </w:p>
         </w:tc>
@@ -1559,19 +1568,19 @@
     </w:tbl>
     <w:p>
       <w:r>
-        <w:pict>
-          <v:rect style="width:0;height:1.5pt" o:hralign="center" o:hrstd="t" o:hr="t"/>
+        <w:pict w14:anchorId="512325F9">
+          <v:rect id="_x0000_i1036" style="width:0;height:1.5pt" o:hralign="center" o:hrstd="t" o:hr="t"/>
         </w:pict>
       </w:r>
     </w:p>
-    <w:bookmarkEnd w:id="32"/>
-    <w:bookmarkStart w:id="33" w:name="best-practice-naming"/>
     <w:p>
       <w:pPr>
         <w:pStyle w:val="Heading1"/>
       </w:pPr>
-      <w:r>
-        <w:t xml:space="preserve">✅ Best Practice Naming</w:t>
+      <w:bookmarkStart w:id="13" w:name="best-practice-naming"/>
+      <w:bookmarkEnd w:id="12"/>
+      <w:r>
+        <w:t>✅ Best Practice Naming</w:t>
       </w:r>
     </w:p>
     <w:p>
@@ -1579,37 +1588,7 @@
         <w:pStyle w:val="FirstParagraph"/>
       </w:pPr>
       <w:r>
-        <w:t xml:space="preserve">Instead of generic adminId, use:</w:t>
-      </w:r>
-      <w:r>
-        <w:t xml:space="preserve"> </w:t>
-      </w:r>
-      <w:r>
-        <w:t xml:space="preserve">- createdBy</w:t>
-      </w:r>
-      <w:r>
-        <w:t xml:space="preserve"> </w:t>
-      </w:r>
-      <w:r>
-        <w:t xml:space="preserve">- updatedBy</w:t>
-      </w:r>
-      <w:r>
-        <w:t xml:space="preserve"> </w:t>
-      </w:r>
-      <w:r>
-        <w:t xml:space="preserve">- approvedBy</w:t>
-      </w:r>
-      <w:r>
-        <w:t xml:space="preserve"> </w:t>
-      </w:r>
-      <w:r>
-        <w:t xml:space="preserve">- verifiedBy</w:t>
-      </w:r>
-      <w:r>
-        <w:t xml:space="preserve"> </w:t>
-      </w:r>
-      <w:r>
-        <w:t xml:space="preserve">- generatedBy</w:t>
+        <w:t>Instead of generic adminId, use: - createdBy - updatedBy - approvedBy - verifiedBy - generatedBy</w:t>
       </w:r>
     </w:p>
     <w:p>
@@ -1617,13 +1596,13 @@
         <w:pStyle w:val="BodyText"/>
       </w:pPr>
       <w:r>
-        <w:t xml:space="preserve">This makes system professional and scalable.</w:t>
-      </w:r>
-    </w:p>
-    <w:p>
-      <w:r>
-        <w:pict>
-          <v:rect style="width:0;height:1.5pt" o:hralign="center" o:hrstd="t" o:hr="t"/>
+        <w:t>This makes system professional and scalable.</w:t>
+      </w:r>
+    </w:p>
+    <w:p>
+      <w:r>
+        <w:pict w14:anchorId="4C749D52">
+          <v:rect id="_x0000_i1037" style="width:0;height:1.5pt" o:hralign="center" o:hrstd="t" o:hr="t"/>
         </w:pict>
       </w:r>
     </w:p>
@@ -1632,31 +1611,7 @@
         <w:pStyle w:val="FirstParagraph"/>
       </w:pPr>
       <w:r>
-        <w:t xml:space="preserve">If you want, I can give you:</w:t>
-      </w:r>
-      <w:r>
-        <w:t xml:space="preserve"> </w:t>
-      </w:r>
-      <w:r>
-        <w:t xml:space="preserve">✅ Full Mongoose Schema code (TypeScript)</w:t>
-      </w:r>
-      <w:r>
-        <w:t xml:space="preserve"> </w:t>
-      </w:r>
-      <w:r>
-        <w:t xml:space="preserve">✅ ER Diagram</w:t>
-      </w:r>
-      <w:r>
-        <w:t xml:space="preserve"> </w:t>
-      </w:r>
-      <w:r>
-        <w:t xml:space="preserve">✅ RBAC Flow Diagram</w:t>
-      </w:r>
-      <w:r>
-        <w:t xml:space="preserve"> </w:t>
-      </w:r>
-      <w:r>
-        <w:t xml:space="preserve">✅ Production-ready folder structure</w:t>
+        <w:t>If you want, I can give you: ✅ Full Mongoose Schema code (TypeScript) ✅ ER Diagram ✅ RBAC Flow Diagram ✅ Production-ready folder structure</w:t>
       </w:r>
     </w:p>
     <w:p>
@@ -1664,47 +1619,28 @@
         <w:pStyle w:val="BodyText"/>
       </w:pPr>
       <w:r>
-        <w:t xml:space="preserve">Just tell me 👍</w:t>
-      </w:r>
-    </w:p>
-    <w:bookmarkEnd w:id="33"/>
+        <w:t>Just tell me 👍</w:t>
+      </w:r>
+      <w:bookmarkEnd w:id="13"/>
+    </w:p>
     <w:sectPr>
       <w:footnotePr>
         <w:numRestart w:val="eachSect"/>
       </w:footnotePr>
+      <w:pgSz w:w="12240" w:h="15840"/>
+      <w:pgMar w:top="180" w:right="1440" w:bottom="90" w:left="1440" w:header="720" w:footer="720" w:gutter="0"/>
+      <w:cols w:space="720"/>
     </w:sectPr>
   </w:body>
 </w:document>
 </file>
 
-<file path=word/comments.xml><?xml version="1.0" encoding="utf-8"?>
-<w:comments xmlns:w="http://schemas.openxmlformats.org/wordprocessingml/2006/main" xmlns:m="http://schemas.openxmlformats.org/officeDocument/2006/math" xmlns:r="http://schemas.openxmlformats.org/officeDocument/2006/relationships" xmlns:o="urn:schemas-microsoft-com:office:office" xmlns:v="urn:schemas-microsoft-com:vml" xmlns:w10="urn:schemas-microsoft-com:office:word" xmlns:a="http://schemas.openxmlformats.org/drawingml/2006/main" xmlns:pic="http://schemas.openxmlformats.org/drawingml/2006/picture" xmlns:wp="http://schemas.openxmlformats.org/drawingml/2006/wordprocessingDrawing"/>
-</file>
-
-<file path=word/footnotes.xml><?xml version="1.0" encoding="utf-8"?>
-<w:footnotes xmlns:w="http://schemas.openxmlformats.org/wordprocessingml/2006/main" xmlns:m="http://schemas.openxmlformats.org/officeDocument/2006/math" xmlns:r="http://schemas.openxmlformats.org/officeDocument/2006/relationships" xmlns:o="urn:schemas-microsoft-com:office:office" xmlns:v="urn:schemas-microsoft-com:vml" xmlns:w10="urn:schemas-microsoft-com:office:word" xmlns:a="http://schemas.openxmlformats.org/drawingml/2006/main" xmlns:pic="http://schemas.openxmlformats.org/drawingml/2006/picture" xmlns:wp="http://schemas.openxmlformats.org/drawingml/2006/wordprocessingDrawing">
-  <w:footnote w:type="continuationSeparator" w:id="0">
-    <w:p>
-      <w:r>
-        <w:continuationSeparator/>
-      </w:r>
-    </w:p>
-  </w:footnote>
-  <w:footnote w:type="separator" w:id="-1">
-    <w:p>
-      <w:r>
-        <w:separator/>
-      </w:r>
-    </w:p>
-  </w:footnote>
-</w:footnotes>
-</file>
-
 <file path=word/numbering.xml><?xml version="1.0" encoding="utf-8"?>
-<w:numbering xmlns:w="http://schemas.openxmlformats.org/wordprocessingml/2006/main">
-  <w:abstractNum w:abstractNumId="990">
+<w:numbering xmlns:wpc="http://schemas.microsoft.com/office/word/2010/wordprocessingCanvas" xmlns:cx="http://schemas.microsoft.com/office/drawing/2014/chartex" xmlns:cx1="http://schemas.microsoft.com/office/drawing/2015/9/8/chartex" xmlns:cx2="http://schemas.microsoft.com/office/drawing/2015/10/21/chartex" xmlns:cx3="http://schemas.microsoft.com/office/drawing/2016/5/9/chartex" xmlns:cx4="http://schemas.microsoft.com/office/drawing/2016/5/10/chartex" xmlns:cx5="http://schemas.microsoft.com/office/drawing/2016/5/11/chartex" xmlns:cx6="http://schemas.microsoft.com/office/drawing/2016/5/12/chartex" xmlns:cx7="http://schemas.microsoft.com/office/drawing/2016/5/13/chartex" xmlns:cx8="http://schemas.microsoft.com/office/drawing/2016/5/14/chartex" xmlns:mc="http://schemas.openxmlformats.org/markup-compatibility/2006" xmlns:aink="http://schemas.microsoft.com/office/drawing/2016/ink" xmlns:am3d="http://schemas.microsoft.com/office/drawing/2017/model3d" xmlns:o="urn:schemas-microsoft-com:office:office" xmlns:oel="http://schemas.microsoft.com/office/2019/extlst" xmlns:r="http://schemas.openxmlformats.org/officeDocument/2006/relationships" xmlns:m="http://schemas.openxmlformats.org/officeDocument/2006/math" xmlns:v="urn:schemas-microsoft-com:vml" xmlns:wp14="http://schemas.microsoft.com/office/word/2010/wordprocessingDrawing" xmlns:wp="http://schemas.openxmlformats.org/drawingml/2006/wordprocessingDrawing" xmlns:w10="urn:schemas-microsoft-com:office:word" xmlns:w="http://schemas.openxmlformats.org/wordprocessingml/2006/main" xmlns:w14="http://schemas.microsoft.com/office/word/2010/wordml" xmlns:w15="http://schemas.microsoft.com/office/word/2012/wordml" xmlns:w16cex="http://schemas.microsoft.com/office/word/2018/wordml/cex" xmlns:w16cid="http://schemas.microsoft.com/office/word/2016/wordml/cid" xmlns:w16="http://schemas.microsoft.com/office/word/2018/wordml" xmlns:w16du="http://schemas.microsoft.com/office/word/2023/wordml/word16du" xmlns:w16sdtdh="http://schemas.microsoft.com/office/word/2020/wordml/sdtdatahash" xmlns:w16sdtfl="http://schemas.microsoft.com/office/word/2024/wordml/sdtformatlock" xmlns:w16se="http://schemas.microsoft.com/office/word/2015/wordml/symex" xmlns:wpg="http://schemas.microsoft.com/office/word/2010/wordprocessingGroup" xmlns:wpi="http://schemas.microsoft.com/office/word/2010/wordprocessingInk" xmlns:wne="http://schemas.microsoft.com/office/word/2006/wordml" xmlns:wps="http://schemas.microsoft.com/office/word/2010/wordprocessingShape" mc:Ignorable="w14 w15 w16se w16cid w16 w16cex w16sdtdh w16sdtfl w16du wp14">
+  <w:abstractNum w:abstractNumId="0" w15:restartNumberingAfterBreak="0">
     <w:nsid w:val="0000A990"/>
     <w:multiLevelType w:val="multilevel"/>
+    <w:tmpl w:val="3D707308"/>
     <w:lvl w:ilvl="0">
       <w:numFmt w:val="bullet"/>
       <w:lvlText w:val=" "/>
@@ -1778,21 +1714,21 @@
       </w:pPr>
     </w:lvl>
   </w:abstractNum>
-  <w:num w:numId="1000">
-    <w:abstractNumId w:val="990"/>
+  <w:num w:numId="1" w16cid:durableId="994842520">
+    <w:abstractNumId w:val="0"/>
   </w:num>
 </w:numbering>
 </file>
 
 <file path=word/styles.xml><?xml version="1.0" encoding="utf-8"?>
-<w:styles xmlns:r="http://schemas.openxmlformats.org/officeDocument/2006/relationships" xmlns:w="http://schemas.openxmlformats.org/wordprocessingml/2006/main">
+<w:styles xmlns:mc="http://schemas.openxmlformats.org/markup-compatibility/2006" xmlns:r="http://schemas.openxmlformats.org/officeDocument/2006/relationships" xmlns:w="http://schemas.openxmlformats.org/wordprocessingml/2006/main" xmlns:w14="http://schemas.microsoft.com/office/word/2010/wordml" xmlns:w15="http://schemas.microsoft.com/office/word/2012/wordml" xmlns:w16cex="http://schemas.microsoft.com/office/word/2018/wordml/cex" xmlns:w16cid="http://schemas.microsoft.com/office/word/2016/wordml/cid" xmlns:w16="http://schemas.microsoft.com/office/word/2018/wordml" xmlns:w16du="http://schemas.microsoft.com/office/word/2023/wordml/word16du" xmlns:w16sdtdh="http://schemas.microsoft.com/office/word/2020/wordml/sdtdatahash" xmlns:w16sdtfl="http://schemas.microsoft.com/office/word/2024/wordml/sdtformatlock" xmlns:w16se="http://schemas.microsoft.com/office/word/2015/wordml/symex" mc:Ignorable="w14 w15 w16se w16cid w16 w16cex w16sdtdh w16sdtfl w16du">
   <w:docDefaults>
     <w:rPrDefault>
       <w:rPr>
-        <w:rFonts w:asciiTheme="minorHAnsi" w:cstheme="minorBidi" w:eastAsiaTheme="minorHAnsi" w:hAnsiTheme="minorHAnsi"/>
+        <w:rFonts w:asciiTheme="minorHAnsi" w:eastAsiaTheme="minorHAnsi" w:hAnsiTheme="minorHAnsi" w:cstheme="minorBidi"/>
         <w:sz w:val="24"/>
         <w:szCs w:val="24"/>
-        <w:lang w:bidi="ar-SA" w:eastAsia="en-US" w:val="en-US"/>
+        <w:lang w:val="en-US" w:eastAsia="en-US" w:bidi="ar-SA"/>
       </w:rPr>
     </w:rPrDefault>
     <w:pPrDefault>
@@ -1801,164 +1737,255 @@
       </w:pPr>
     </w:pPrDefault>
   </w:docDefaults>
-  <w:latentStyles w:count="276" w:defLockedState="0" w:defQFormat="0" w:defSemiHidden="0" w:defUIPriority="0" w:defUnhideWhenUsed="0"/>
-  <w:style w:default="1" w:styleId="Normal" w:type="paragraph">
+  <w:latentStyles w:defLockedState="0" w:defUIPriority="0" w:defSemiHidden="0" w:defUnhideWhenUsed="0" w:defQFormat="0" w:count="376">
+    <w:lsdException w:name="Normal Table" w:semiHidden="1" w:unhideWhenUsed="1"/>
+    <w:lsdException w:name="Table Simple 1" w:semiHidden="1" w:unhideWhenUsed="1"/>
+    <w:lsdException w:name="Table Simple 2" w:semiHidden="1" w:unhideWhenUsed="1"/>
+    <w:lsdException w:name="Table Simple 3" w:semiHidden="1" w:unhideWhenUsed="1"/>
+    <w:lsdException w:name="Table Classic 1" w:semiHidden="1" w:unhideWhenUsed="1"/>
+    <w:lsdException w:name="Table Classic 2" w:semiHidden="1" w:unhideWhenUsed="1"/>
+    <w:lsdException w:name="Table Classic 3" w:semiHidden="1" w:unhideWhenUsed="1"/>
+    <w:lsdException w:name="Table Classic 4" w:semiHidden="1" w:unhideWhenUsed="1"/>
+    <w:lsdException w:name="Table Colorful 1" w:semiHidden="1" w:unhideWhenUsed="1"/>
+    <w:lsdException w:name="Table Colorful 2" w:semiHidden="1" w:unhideWhenUsed="1"/>
+    <w:lsdException w:name="Table Colorful 3" w:semiHidden="1" w:unhideWhenUsed="1"/>
+    <w:lsdException w:name="Table Columns 1" w:semiHidden="1" w:unhideWhenUsed="1"/>
+    <w:lsdException w:name="Table Columns 2" w:semiHidden="1" w:unhideWhenUsed="1"/>
+    <w:lsdException w:name="Table Columns 3" w:semiHidden="1" w:unhideWhenUsed="1"/>
+    <w:lsdException w:name="Table Columns 4" w:semiHidden="1" w:unhideWhenUsed="1"/>
+    <w:lsdException w:name="Table Columns 5" w:semiHidden="1" w:unhideWhenUsed="1"/>
+    <w:lsdException w:name="Table Grid 1" w:semiHidden="1" w:unhideWhenUsed="1"/>
+    <w:lsdException w:name="Table Grid 2" w:semiHidden="1" w:unhideWhenUsed="1"/>
+    <w:lsdException w:name="Table Grid 3" w:semiHidden="1" w:unhideWhenUsed="1"/>
+    <w:lsdException w:name="Table Grid 4" w:semiHidden="1" w:unhideWhenUsed="1"/>
+    <w:lsdException w:name="Table Grid 5" w:semiHidden="1" w:unhideWhenUsed="1"/>
+    <w:lsdException w:name="Table Grid 6" w:semiHidden="1" w:unhideWhenUsed="1"/>
+    <w:lsdException w:name="Table Grid 7" w:semiHidden="1" w:unhideWhenUsed="1"/>
+    <w:lsdException w:name="Table Grid 8" w:semiHidden="1" w:unhideWhenUsed="1"/>
+    <w:lsdException w:name="Table List 1" w:semiHidden="1" w:unhideWhenUsed="1"/>
+    <w:lsdException w:name="Table List 2" w:semiHidden="1" w:unhideWhenUsed="1"/>
+    <w:lsdException w:name="Table List 3" w:semiHidden="1" w:unhideWhenUsed="1"/>
+    <w:lsdException w:name="Table List 4" w:semiHidden="1" w:unhideWhenUsed="1"/>
+    <w:lsdException w:name="Table List 5" w:semiHidden="1" w:unhideWhenUsed="1"/>
+    <w:lsdException w:name="Table List 6" w:semiHidden="1" w:unhideWhenUsed="1"/>
+    <w:lsdException w:name="Table List 7" w:semiHidden="1" w:unhideWhenUsed="1"/>
+    <w:lsdException w:name="Table List 8" w:semiHidden="1" w:unhideWhenUsed="1"/>
+    <w:lsdException w:name="Table 3D effects 1" w:semiHidden="1" w:unhideWhenUsed="1"/>
+    <w:lsdException w:name="Table 3D effects 2" w:semiHidden="1" w:unhideWhenUsed="1"/>
+    <w:lsdException w:name="Table 3D effects 3" w:semiHidden="1" w:unhideWhenUsed="1"/>
+    <w:lsdException w:name="Table Contemporary" w:semiHidden="1" w:unhideWhenUsed="1"/>
+    <w:lsdException w:name="Table Elegant" w:semiHidden="1" w:unhideWhenUsed="1"/>
+    <w:lsdException w:name="Table Professional" w:semiHidden="1" w:unhideWhenUsed="1"/>
+    <w:lsdException w:name="Table Subtle 1" w:semiHidden="1" w:unhideWhenUsed="1"/>
+    <w:lsdException w:name="Table Subtle 2" w:semiHidden="1" w:unhideWhenUsed="1"/>
+    <w:lsdException w:name="Table Web 1" w:semiHidden="1" w:unhideWhenUsed="1"/>
+    <w:lsdException w:name="Table Web 2" w:semiHidden="1" w:unhideWhenUsed="1"/>
+    <w:lsdException w:name="Table Web 3" w:semiHidden="1" w:unhideWhenUsed="1"/>
+    <w:lsdException w:name="Table Theme" w:semiHidden="1" w:unhideWhenUsed="1"/>
+    <w:lsdException w:name="Light Shading"/>
+    <w:lsdException w:name="Light List"/>
+    <w:lsdException w:name="Light Grid"/>
+    <w:lsdException w:name="Medium Shading 1"/>
+    <w:lsdException w:name="Medium Shading 2"/>
+    <w:lsdException w:name="Medium List 1"/>
+    <w:lsdException w:name="Medium List 2"/>
+    <w:lsdException w:name="Medium Grid 1"/>
+    <w:lsdException w:name="Medium Grid 2"/>
+    <w:lsdException w:name="Medium Grid 3"/>
+    <w:lsdException w:name="Dark List"/>
+    <w:lsdException w:name="Colorful Shading"/>
+    <w:lsdException w:name="Colorful List"/>
+    <w:lsdException w:name="Colorful Grid"/>
+    <w:lsdException w:name="Light Shading Accent 1"/>
+    <w:lsdException w:name="Light List Accent 1"/>
+    <w:lsdException w:name="Light Grid Accent 1"/>
+    <w:lsdException w:name="Medium Shading 1 Accent 1"/>
+    <w:lsdException w:name="Medium Shading 2 Accent 1"/>
+    <w:lsdException w:name="Medium List 1 Accent 1"/>
+    <w:lsdException w:name="Medium List 2 Accent 1"/>
+    <w:lsdException w:name="Medium Grid 1 Accent 1"/>
+    <w:lsdException w:name="Medium Grid 2 Accent 1"/>
+    <w:lsdException w:name="Medium Grid 3 Accent 1"/>
+    <w:lsdException w:name="Dark List Accent 1"/>
+    <w:lsdException w:name="Colorful Shading Accent 1"/>
+    <w:lsdException w:name="Colorful List Accent 1"/>
+    <w:lsdException w:name="Colorful Grid Accent 1"/>
+    <w:lsdException w:name="Light Shading Accent 2"/>
+    <w:lsdException w:name="Light List Accent 2"/>
+    <w:lsdException w:name="Light Grid Accent 2"/>
+    <w:lsdException w:name="Medium Shading 1 Accent 2"/>
+    <w:lsdException w:name="Medium Shading 2 Accent 2"/>
+    <w:lsdException w:name="Medium List 1 Accent 2"/>
+    <w:lsdException w:name="Medium List 2 Accent 2"/>
+    <w:lsdException w:name="Medium Grid 1 Accent 2"/>
+    <w:lsdException w:name="Medium Grid 2 Accent 2"/>
+    <w:lsdException w:name="Medium Grid 3 Accent 2"/>
+    <w:lsdException w:name="Dark List Accent 2"/>
+    <w:lsdException w:name="Colorful Shading Accent 2"/>
+    <w:lsdException w:name="Colorful List Accent 2"/>
+    <w:lsdException w:name="Colorful Grid Accent 2"/>
+    <w:lsdException w:name="Light Shading Accent 3"/>
+    <w:lsdException w:name="Light List Accent 3"/>
+    <w:lsdException w:name="Light Grid Accent 3"/>
+    <w:lsdException w:name="Medium Shading 1 Accent 3"/>
+    <w:lsdException w:name="Medium Shading 2 Accent 3"/>
+    <w:lsdException w:name="Medium List 1 Accent 3"/>
+    <w:lsdException w:name="Medium List 2 Accent 3"/>
+    <w:lsdException w:name="Medium Grid 1 Accent 3"/>
+    <w:lsdException w:name="Medium Grid 2 Accent 3"/>
+    <w:lsdException w:name="Medium Grid 3 Accent 3"/>
+    <w:lsdException w:name="Dark List Accent 3"/>
+    <w:lsdException w:name="Colorful Shading Accent 3"/>
+    <w:lsdException w:name="Colorful List Accent 3"/>
+    <w:lsdException w:name="Colorful Grid Accent 3"/>
+    <w:lsdException w:name="Light Shading Accent 4"/>
+    <w:lsdException w:name="Light List Accent 4"/>
+    <w:lsdException w:name="Light Grid Accent 4"/>
+    <w:lsdException w:name="Medium Shading 1 Accent 4"/>
+    <w:lsdException w:name="Medium Shading 2 Accent 4"/>
+    <w:lsdException w:name="Medium List 1 Accent 4"/>
+    <w:lsdException w:name="Medium List 2 Accent 4"/>
+    <w:lsdException w:name="Medium Grid 1 Accent 4"/>
+    <w:lsdException w:name="Medium Grid 2 Accent 4"/>
+    <w:lsdException w:name="Medium Grid 3 Accent 4"/>
+    <w:lsdException w:name="Dark List Accent 4"/>
+    <w:lsdException w:name="Colorful Shading Accent 4"/>
+    <w:lsdException w:name="Colorful List Accent 4"/>
+    <w:lsdException w:name="Colorful Grid Accent 4"/>
+    <w:lsdException w:name="Light Shading Accent 5"/>
+    <w:lsdException w:name="Light List Accent 5"/>
+    <w:lsdException w:name="Light Grid Accent 5"/>
+    <w:lsdException w:name="Medium Shading 1 Accent 5"/>
+    <w:lsdException w:name="Medium Shading 2 Accent 5"/>
+    <w:lsdException w:name="Medium List 1 Accent 5"/>
+    <w:lsdException w:name="Medium List 2 Accent 5"/>
+    <w:lsdException w:name="Medium Grid 1 Accent 5"/>
+    <w:lsdException w:name="Medium Grid 2 Accent 5"/>
+    <w:lsdException w:name="Medium Grid 3 Accent 5"/>
+    <w:lsdException w:name="Dark List Accent 5"/>
+    <w:lsdException w:name="Colorful Shading Accent 5"/>
+    <w:lsdException w:name="Colorful List Accent 5"/>
+    <w:lsdException w:name="Colorful Grid Accent 5"/>
+    <w:lsdException w:name="Light Shading Accent 6"/>
+    <w:lsdException w:name="Light List Accent 6"/>
+    <w:lsdException w:name="Light Grid Accent 6"/>
+    <w:lsdException w:name="Medium Shading 1 Accent 6"/>
+    <w:lsdException w:name="Medium Shading 2 Accent 6"/>
+    <w:lsdException w:name="Medium List 1 Accent 6"/>
+    <w:lsdException w:name="Medium List 2 Accent 6"/>
+    <w:lsdException w:name="Medium Grid 1 Accent 6"/>
+    <w:lsdException w:name="Medium Grid 2 Accent 6"/>
+    <w:lsdException w:name="Medium Grid 3 Accent 6"/>
+    <w:lsdException w:name="Dark List Accent 6"/>
+    <w:lsdException w:name="Colorful Shading Accent 6"/>
+    <w:lsdException w:name="Colorful List Accent 6"/>
+    <w:lsdException w:name="Colorful Grid Accent 6"/>
+    <w:lsdException w:name="Grid Table 4" w:uiPriority="49"/>
+    <w:lsdException w:name="Grid Table 5 Dark" w:uiPriority="50"/>
+    <w:lsdException w:name="Grid Table 6 Colorful" w:uiPriority="51"/>
+    <w:lsdException w:name="Grid Table 7 Colorful" w:uiPriority="52"/>
+    <w:lsdException w:name="Grid Table 1 Light Accent 1" w:uiPriority="46"/>
+    <w:lsdException w:name="Grid Table 2 Accent 1" w:uiPriority="47"/>
+    <w:lsdException w:name="Grid Table 3 Accent 1" w:uiPriority="48"/>
+    <w:lsdException w:name="Grid Table 4 Accent 1" w:uiPriority="49"/>
+    <w:lsdException w:name="Grid Table 5 Dark Accent 1" w:uiPriority="50"/>
+    <w:lsdException w:name="Grid Table 6 Colorful Accent 1" w:uiPriority="51"/>
+    <w:lsdException w:name="Grid Table 7 Colorful Accent 1" w:uiPriority="52"/>
+    <w:lsdException w:name="Grid Table 1 Light Accent 2" w:uiPriority="46"/>
+    <w:lsdException w:name="Grid Table 2 Accent 2" w:uiPriority="47"/>
+    <w:lsdException w:name="Grid Table 3 Accent 2" w:uiPriority="48"/>
+    <w:lsdException w:name="Grid Table 4 Accent 2" w:uiPriority="49"/>
+    <w:lsdException w:name="Grid Table 5 Dark Accent 2" w:uiPriority="50"/>
+    <w:lsdException w:name="Grid Table 6 Colorful Accent 2" w:uiPriority="51"/>
+    <w:lsdException w:name="Grid Table 7 Colorful Accent 2" w:uiPriority="52"/>
+    <w:lsdException w:name="Grid Table 1 Light Accent 3" w:uiPriority="46"/>
+    <w:lsdException w:name="Grid Table 2 Accent 3" w:uiPriority="47"/>
+    <w:lsdException w:name="Grid Table 3 Accent 3" w:uiPriority="48"/>
+    <w:lsdException w:name="Grid Table 4 Accent 3" w:uiPriority="49"/>
+    <w:lsdException w:name="Grid Table 5 Dark Accent 3" w:uiPriority="50"/>
+    <w:lsdException w:name="Grid Table 6 Colorful Accent 3" w:uiPriority="51"/>
+    <w:lsdException w:name="Grid Table 7 Colorful Accent 3" w:uiPriority="52"/>
+    <w:lsdException w:name="Grid Table 1 Light Accent 4" w:uiPriority="46"/>
+    <w:lsdException w:name="Grid Table 2 Accent 4" w:uiPriority="47"/>
+    <w:lsdException w:name="Grid Table 3 Accent 4" w:uiPriority="48"/>
+    <w:lsdException w:name="Grid Table 4 Accent 4" w:uiPriority="49"/>
+    <w:lsdException w:name="Grid Table 5 Dark Accent 4" w:uiPriority="50"/>
+    <w:lsdException w:name="Grid Table 6 Colorful Accent 4" w:uiPriority="51"/>
+    <w:lsdException w:name="Grid Table 7 Colorful Accent 4" w:uiPriority="52"/>
+    <w:lsdException w:name="Grid Table 1 Light Accent 5" w:uiPriority="46"/>
+    <w:lsdException w:name="Grid Table 2 Accent 5" w:uiPriority="47"/>
+    <w:lsdException w:name="Grid Table 3 Accent 5" w:uiPriority="48"/>
+    <w:lsdException w:name="Grid Table 4 Accent 5" w:uiPriority="49"/>
+    <w:lsdException w:name="Grid Table 5 Dark Accent 5" w:uiPriority="50"/>
+    <w:lsdException w:name="Grid Table 6 Colorful Accent 5" w:uiPriority="51"/>
+    <w:lsdException w:name="Grid Table 7 Colorful Accent 5" w:uiPriority="52"/>
+    <w:lsdException w:name="Grid Table 1 Light Accent 6" w:uiPriority="46"/>
+    <w:lsdException w:name="Grid Table 2 Accent 6" w:uiPriority="47"/>
+    <w:lsdException w:name="Grid Table 3 Accent 6" w:uiPriority="48"/>
+    <w:lsdException w:name="Grid Table 4 Accent 6" w:uiPriority="49"/>
+    <w:lsdException w:name="Grid Table 5 Dark Accent 6" w:uiPriority="50"/>
+    <w:lsdException w:name="Grid Table 6 Colorful Accent 6" w:uiPriority="51"/>
+    <w:lsdException w:name="Grid Table 7 Colorful Accent 6" w:uiPriority="52"/>
+    <w:lsdException w:name="List Table 1 Light" w:uiPriority="46"/>
+    <w:lsdException w:name="List Table 2" w:uiPriority="47"/>
+    <w:lsdException w:name="List Table 3" w:uiPriority="48"/>
+    <w:lsdException w:name="List Table 4" w:uiPriority="49"/>
+    <w:lsdException w:name="List Table 5 Dark" w:uiPriority="50"/>
+    <w:lsdException w:name="List Table 6 Colorful" w:uiPriority="51"/>
+    <w:lsdException w:name="List Table 7 Colorful" w:uiPriority="52"/>
+    <w:lsdException w:name="List Table 1 Light Accent 1" w:uiPriority="46"/>
+    <w:lsdException w:name="List Table 2 Accent 1" w:uiPriority="47"/>
+    <w:lsdException w:name="List Table 3 Accent 1" w:uiPriority="48"/>
+    <w:lsdException w:name="List Table 4 Accent 1" w:uiPriority="49"/>
+    <w:lsdException w:name="List Table 5 Dark Accent 1" w:uiPriority="50"/>
+    <w:lsdException w:name="List Table 6 Colorful Accent 1" w:uiPriority="51"/>
+    <w:lsdException w:name="List Table 7 Colorful Accent 1" w:uiPriority="52"/>
+    <w:lsdException w:name="List Table 1 Light Accent 2" w:uiPriority="46"/>
+    <w:lsdException w:name="List Table 2 Accent 2" w:uiPriority="47"/>
+    <w:lsdException w:name="List Table 3 Accent 2" w:uiPriority="48"/>
+    <w:lsdException w:name="List Table 4 Accent 2" w:uiPriority="49"/>
+    <w:lsdException w:name="List Table 5 Dark Accent 2" w:uiPriority="50"/>
+    <w:lsdException w:name="List Table 6 Colorful Accent 2" w:uiPriority="51"/>
+    <w:lsdException w:name="List Table 7 Colorful Accent 2" w:uiPriority="52"/>
+    <w:lsdException w:name="List Table 1 Light Accent 3" w:uiPriority="46"/>
+    <w:lsdException w:name="List Table 2 Accent 3" w:uiPriority="47"/>
+    <w:lsdException w:name="List Table 3 Accent 3" w:uiPriority="48"/>
+    <w:lsdException w:name="List Table 4 Accent 3" w:uiPriority="49"/>
+    <w:lsdException w:name="List Table 5 Dark Accent 3" w:uiPriority="50"/>
+    <w:lsdException w:name="List Table 6 Colorful Accent 3" w:uiPriority="51"/>
+    <w:lsdException w:name="List Table 7 Colorful Accent 3" w:uiPriority="52"/>
+    <w:lsdException w:name="List Table 1 Light Accent 4" w:uiPriority="46"/>
+    <w:lsdException w:name="List Table 2 Accent 4" w:uiPriority="47"/>
+    <w:lsdException w:name="List Table 3 Accent 4" w:uiPriority="48"/>
+    <w:lsdException w:name="List Table 4 Accent 4" w:uiPriority="49"/>
+    <w:lsdException w:name="List Table 5 Dark Accent 4" w:uiPriority="50"/>
+    <w:lsdException w:name="List Table 6 Colorful Accent 4" w:uiPriority="51"/>
+    <w:lsdException w:name="List Table 7 Colorful Accent 4" w:uiPriority="52"/>
+    <w:lsdException w:name="List Table 1 Light Accent 5" w:uiPriority="46"/>
+    <w:lsdException w:name="List Table 2 Accent 5" w:uiPriority="47"/>
+    <w:lsdException w:name="List Table 3 Accent 5" w:uiPriority="48"/>
+    <w:lsdException w:name="List Table 4 Accent 5" w:uiPriority="49"/>
+    <w:lsdException w:name="List Table 5 Dark Accent 5" w:uiPriority="50"/>
+    <w:lsdException w:name="List Table 6 Colorful Accent 5" w:uiPriority="51"/>
+    <w:lsdException w:name="List Table 7 Colorful Accent 5" w:uiPriority="52"/>
+    <w:lsdException w:name="List Table 1 Light Accent 6" w:uiPriority="46"/>
+    <w:lsdException w:name="List Table 2 Accent 6" w:uiPriority="47"/>
+    <w:lsdException w:name="List Table 3 Accent 6" w:uiPriority="48"/>
+    <w:lsdException w:name="List Table 4 Accent 6" w:uiPriority="49"/>
+    <w:lsdException w:name="List Table 5 Dark Accent 6" w:uiPriority="50"/>
+    <w:lsdException w:name="List Table 6 Colorful Accent 6" w:uiPriority="51"/>
+    <w:lsdException w:name="List Table 7 Colorful Accent 6" w:uiPriority="52"/>
+    <w:lsdException w:name="Mention" w:semiHidden="1" w:uiPriority="99" w:unhideWhenUsed="1"/>
+    <w:lsdException w:name="Smart Hyperlink" w:semiHidden="1" w:uiPriority="99" w:unhideWhenUsed="1"/>
+    <w:lsdException w:name="Hashtag" w:semiHidden="1" w:uiPriority="99" w:unhideWhenUsed="1"/>
+    <w:lsdException w:name="Unresolved Mention" w:semiHidden="1" w:uiPriority="99" w:unhideWhenUsed="1"/>
+    <w:lsdException w:name="Smart Link" w:semiHidden="1" w:uiPriority="99" w:unhideWhenUsed="1"/>
+  </w:latentStyles>
+  <w:style w:type="paragraph" w:default="1" w:styleId="Normal">
     <w:name w:val="Normal"/>
     <w:qFormat/>
   </w:style>
-  <w:style w:styleId="BodyText" w:type="paragraph">
-    <w:name w:val="Body Text"/>
-    <w:basedOn w:val="Normal"/>
-    <w:link w:val="BodyTextChar"/>
-    <w:qFormat/>
-    <w:pPr>
-      <w:spacing w:after="180" w:before="180"/>
-    </w:pPr>
-  </w:style>
-  <w:style w:customStyle="1" w:styleId="FirstParagraph" w:type="paragraph">
-    <w:name w:val="First Paragraph"/>
-    <w:basedOn w:val="BodyText"/>
-    <w:next w:val="BodyText"/>
-    <w:qFormat/>
-  </w:style>
-  <w:style w:customStyle="1" w:styleId="Compact" w:type="paragraph">
-    <w:name w:val="Compact"/>
-    <w:basedOn w:val="BodyText"/>
-    <w:qFormat/>
-    <w:pPr>
-      <w:spacing w:after="36" w:before="36"/>
-    </w:pPr>
-  </w:style>
-  <w:style w:styleId="Title" w:type="paragraph">
-    <w:name w:val="Title"/>
-    <w:basedOn w:val="Normal"/>
-    <w:next w:val="BodyText"/>
-    <w:link w:val="TitleChar"/>
-    <w:uiPriority w:val="10"/>
-    <w:qFormat/>
-    <w:rsid w:val="00A10FD9"/>
-    <w:pPr>
-      <w:spacing w:after="80" w:line="240" w:lineRule="auto"/>
-      <w:contextualSpacing/>
-      <w:jc w:val="center"/>
-    </w:pPr>
-    <w:rPr>
-      <w:rFonts w:asciiTheme="majorHAnsi" w:cstheme="majorBidi" w:eastAsiaTheme="majorEastAsia" w:hAnsiTheme="majorHAnsi"/>
-      <w:spacing w:val="-10"/>
-      <w:kern w:val="28"/>
-      <w:sz w:val="56"/>
-      <w:szCs w:val="56"/>
-    </w:rPr>
-  </w:style>
-  <w:style w:customStyle="1" w:styleId="TitleChar" w:type="character">
-    <w:name w:val="Title Char"/>
-    <w:basedOn w:val="DefaultParagraphFont"/>
-    <w:link w:val="Title"/>
-    <w:uiPriority w:val="10"/>
-    <w:rsid w:val="00A10FD9"/>
-    <w:rPr>
-      <w:rFonts w:asciiTheme="majorHAnsi" w:cstheme="majorBidi" w:eastAsiaTheme="majorEastAsia" w:hAnsiTheme="majorHAnsi"/>
-      <w:spacing w:val="-10"/>
-      <w:kern w:val="28"/>
-      <w:sz w:val="56"/>
-      <w:szCs w:val="56"/>
-    </w:rPr>
-  </w:style>
-  <w:style w:styleId="Subtitle" w:type="paragraph">
-    <w:name w:val="Subtitle"/>
-    <w:basedOn w:val="Title"/>
-    <w:next w:val="BodyText"/>
-    <w:link w:val="SubtitleChar"/>
-    <w:uiPriority w:val="11"/>
-    <w:qFormat/>
-    <w:rsid w:val="00A10FD9"/>
-    <w:pPr>
-      <w:numPr>
-        <w:ilvl w:val="1"/>
-      </w:numPr>
-    </w:pPr>
-    <w:rPr>
-      <w:rFonts w:cstheme="majorBidi" w:eastAsiaTheme="majorEastAsia"/>
-      <w:spacing w:val="15"/>
-      <w:sz w:val="28"/>
-      <w:szCs w:val="28"/>
-    </w:rPr>
-  </w:style>
-  <w:style w:customStyle="1" w:styleId="SubtitleChar" w:type="character">
-    <w:name w:val="Subtitle Char"/>
-    <w:basedOn w:val="DefaultParagraphFont"/>
-    <w:link w:val="Subtitle"/>
-    <w:uiPriority w:val="11"/>
-    <w:rsid w:val="00A10FD9"/>
-    <w:rPr>
-      <w:rFonts w:cstheme="majorBidi" w:eastAsiaTheme="majorEastAsia"/>
-      <w:color w:themeColor="text1" w:themeTint="A6" w:val="595959"/>
-      <w:spacing w:val="15"/>
-      <w:sz w:val="28"/>
-      <w:szCs w:val="28"/>
-    </w:rPr>
-  </w:style>
-  <w:style w:customStyle="1" w:styleId="Author" w:type="paragraph">
-    <w:name w:val="Author"/>
-    <w:next w:val="BodyText"/>
-    <w:qFormat/>
-    <w:pPr>
-      <w:keepNext/>
-      <w:keepLines/>
-      <w:jc w:val="center"/>
-    </w:pPr>
-  </w:style>
-  <w:style w:styleId="Date" w:type="paragraph">
-    <w:name w:val="Date"/>
-    <w:next w:val="BodyText"/>
-    <w:qFormat/>
-    <w:pPr>
-      <w:keepNext/>
-      <w:keepLines/>
-      <w:jc w:val="center"/>
-    </w:pPr>
-  </w:style>
-  <w:style w:customStyle="1" w:styleId="AbstractTitle" w:type="paragraph">
-    <w:name w:val="Abstract Title"/>
-    <w:basedOn w:val="Normal"/>
-    <w:next w:val="Abstract"/>
-    <w:qFormat/>
-    <w:pPr>
-      <w:keepNext/>
-      <w:keepLines/>
-      <w:spacing w:after="0" w:before="300"/>
-      <w:jc w:val="center"/>
-    </w:pPr>
-    <w:rPr>
-      <w:b/>
-      <w:sz w:val="20"/>
-      <w:szCs w:val="20"/>
-    </w:rPr>
-  </w:style>
-  <w:style w:customStyle="1" w:styleId="Abstract" w:type="paragraph">
-    <w:name w:val="Abstract"/>
-    <w:basedOn w:val="Normal"/>
-    <w:next w:val="BodyText"/>
-    <w:qFormat/>
-    <w:pPr>
-      <w:keepNext/>
-      <w:keepLines/>
-      <w:spacing w:after="300" w:before="100"/>
-    </w:pPr>
-    <w:rPr>
-      <w:sz w:val="20"/>
-      <w:szCs w:val="20"/>
-    </w:rPr>
-  </w:style>
-  <w:style w:styleId="Bibliography" w:type="paragraph">
-    <w:name w:val="Bibliography"/>
-    <w:basedOn w:val="Normal"/>
-    <w:next w:val="Bibliography"/>
-    <w:qFormat/>
-    <w:pPr/>
-    <w:rPr/>
-  </w:style>
-  <w:style w:styleId="Heading1" w:type="paragraph">
+  <w:style w:type="paragraph" w:styleId="Heading1">
     <w:name w:val="heading 1"/>
     <w:basedOn w:val="Normal"/>
     <w:next w:val="BodyText"/>
@@ -1969,17 +1996,17 @@
     <w:pPr>
       <w:keepNext/>
       <w:keepLines/>
-      <w:spacing w:after="80" w:before="360"/>
+      <w:spacing w:before="360" w:after="80"/>
       <w:outlineLvl w:val="0"/>
     </w:pPr>
     <w:rPr>
-      <w:rFonts w:asciiTheme="majorHAnsi" w:cstheme="majorBidi" w:eastAsiaTheme="majorEastAsia" w:hAnsiTheme="majorHAnsi"/>
-      <w:color w:themeColor="accent1" w:themeShade="BF" w:val="0F4761"/>
+      <w:rFonts w:asciiTheme="majorHAnsi" w:eastAsiaTheme="majorEastAsia" w:hAnsiTheme="majorHAnsi" w:cstheme="majorBidi"/>
+      <w:color w:val="0F4761" w:themeColor="accent1" w:themeShade="BF"/>
       <w:sz w:val="40"/>
       <w:szCs w:val="40"/>
     </w:rPr>
   </w:style>
-  <w:style w:styleId="Heading2" w:type="paragraph">
+  <w:style w:type="paragraph" w:styleId="Heading2">
     <w:name w:val="heading 2"/>
     <w:basedOn w:val="Normal"/>
     <w:next w:val="BodyText"/>
@@ -1992,17 +2019,17 @@
     <w:pPr>
       <w:keepNext/>
       <w:keepLines/>
-      <w:spacing w:after="80" w:before="160"/>
+      <w:spacing w:before="160" w:after="80"/>
       <w:outlineLvl w:val="1"/>
     </w:pPr>
     <w:rPr>
-      <w:rFonts w:asciiTheme="majorHAnsi" w:cstheme="majorBidi" w:eastAsiaTheme="majorEastAsia" w:hAnsiTheme="majorHAnsi"/>
-      <w:color w:themeColor="accent1" w:themeShade="BF" w:val="0F4761"/>
+      <w:rFonts w:asciiTheme="majorHAnsi" w:eastAsiaTheme="majorEastAsia" w:hAnsiTheme="majorHAnsi" w:cstheme="majorBidi"/>
+      <w:color w:val="0F4761" w:themeColor="accent1" w:themeShade="BF"/>
       <w:sz w:val="32"/>
       <w:szCs w:val="32"/>
     </w:rPr>
   </w:style>
-  <w:style w:styleId="Heading3" w:type="paragraph">
+  <w:style w:type="paragraph" w:styleId="Heading3">
     <w:name w:val="heading 3"/>
     <w:basedOn w:val="Normal"/>
     <w:next w:val="BodyText"/>
@@ -2015,17 +2042,17 @@
     <w:pPr>
       <w:keepNext/>
       <w:keepLines/>
-      <w:spacing w:after="80" w:before="160"/>
+      <w:spacing w:before="160" w:after="80"/>
       <w:outlineLvl w:val="2"/>
     </w:pPr>
     <w:rPr>
-      <w:rFonts w:cstheme="majorBidi" w:eastAsiaTheme="majorEastAsia"/>
-      <w:color w:themeColor="accent1" w:themeShade="BF" w:val="0F4761"/>
+      <w:rFonts w:eastAsiaTheme="majorEastAsia" w:cstheme="majorBidi"/>
+      <w:color w:val="0F4761" w:themeColor="accent1" w:themeShade="BF"/>
       <w:sz w:val="28"/>
       <w:szCs w:val="28"/>
     </w:rPr>
   </w:style>
-  <w:style w:styleId="Heading4" w:type="paragraph">
+  <w:style w:type="paragraph" w:styleId="Heading4">
     <w:name w:val="heading 4"/>
     <w:basedOn w:val="Normal"/>
     <w:next w:val="BodyText"/>
@@ -2038,17 +2065,17 @@
     <w:pPr>
       <w:keepNext/>
       <w:keepLines/>
-      <w:spacing w:after="40" w:before="80"/>
+      <w:spacing w:before="80" w:after="40"/>
       <w:outlineLvl w:val="3"/>
     </w:pPr>
     <w:rPr>
-      <w:rFonts w:cstheme="majorBidi" w:eastAsiaTheme="majorEastAsia"/>
+      <w:rFonts w:eastAsiaTheme="majorEastAsia" w:cstheme="majorBidi"/>
       <w:i/>
       <w:iCs/>
-      <w:color w:themeColor="accent1" w:themeShade="BF" w:val="0F4761"/>
-    </w:rPr>
-  </w:style>
-  <w:style w:styleId="Heading5" w:type="paragraph">
+      <w:color w:val="0F4761" w:themeColor="accent1" w:themeShade="BF"/>
+    </w:rPr>
+  </w:style>
+  <w:style w:type="paragraph" w:styleId="Heading5">
     <w:name w:val="heading 5"/>
     <w:basedOn w:val="Normal"/>
     <w:next w:val="BodyText"/>
@@ -2061,15 +2088,15 @@
     <w:pPr>
       <w:keepNext/>
       <w:keepLines/>
-      <w:spacing w:after="40" w:before="80"/>
+      <w:spacing w:before="80" w:after="40"/>
       <w:outlineLvl w:val="4"/>
     </w:pPr>
     <w:rPr>
-      <w:rFonts w:cstheme="majorBidi" w:eastAsiaTheme="majorEastAsia"/>
-      <w:color w:themeColor="accent1" w:themeShade="BF" w:val="0F4761"/>
-    </w:rPr>
-  </w:style>
-  <w:style w:styleId="Heading6" w:type="paragraph">
+      <w:rFonts w:eastAsiaTheme="majorEastAsia" w:cstheme="majorBidi"/>
+      <w:color w:val="0F4761" w:themeColor="accent1" w:themeShade="BF"/>
+    </w:rPr>
+  </w:style>
+  <w:style w:type="paragraph" w:styleId="Heading6">
     <w:name w:val="heading 6"/>
     <w:basedOn w:val="Normal"/>
     <w:next w:val="BodyText"/>
@@ -2082,17 +2109,17 @@
     <w:pPr>
       <w:keepNext/>
       <w:keepLines/>
-      <w:spacing w:after="0" w:before="40"/>
+      <w:spacing w:before="40" w:after="0"/>
       <w:outlineLvl w:val="5"/>
     </w:pPr>
     <w:rPr>
-      <w:rFonts w:cstheme="majorBidi" w:eastAsiaTheme="majorEastAsia"/>
+      <w:rFonts w:eastAsiaTheme="majorEastAsia" w:cstheme="majorBidi"/>
       <w:i/>
       <w:iCs/>
-      <w:color w:themeColor="text1" w:themeTint="A6" w:val="595959"/>
-    </w:rPr>
-  </w:style>
-  <w:style w:styleId="Heading7" w:type="paragraph">
+      <w:color w:val="595959" w:themeColor="text1" w:themeTint="A6"/>
+    </w:rPr>
+  </w:style>
+  <w:style w:type="paragraph" w:styleId="Heading7">
     <w:name w:val="heading 7"/>
     <w:basedOn w:val="Normal"/>
     <w:next w:val="BodyText"/>
@@ -2105,15 +2132,15 @@
     <w:pPr>
       <w:keepNext/>
       <w:keepLines/>
-      <w:spacing w:after="0" w:before="40"/>
+      <w:spacing w:before="40" w:after="0"/>
       <w:outlineLvl w:val="6"/>
     </w:pPr>
     <w:rPr>
-      <w:rFonts w:cstheme="majorBidi" w:eastAsiaTheme="majorEastAsia"/>
-      <w:color w:themeColor="text1" w:themeTint="A6" w:val="595959"/>
-    </w:rPr>
-  </w:style>
-  <w:style w:styleId="Heading8" w:type="paragraph">
+      <w:rFonts w:eastAsiaTheme="majorEastAsia" w:cstheme="majorBidi"/>
+      <w:color w:val="595959" w:themeColor="text1" w:themeTint="A6"/>
+    </w:rPr>
+  </w:style>
+  <w:style w:type="paragraph" w:styleId="Heading8">
     <w:name w:val="heading 8"/>
     <w:basedOn w:val="Normal"/>
     <w:next w:val="BodyText"/>
@@ -2130,13 +2157,13 @@
       <w:outlineLvl w:val="7"/>
     </w:pPr>
     <w:rPr>
-      <w:rFonts w:cstheme="majorBidi" w:eastAsiaTheme="majorEastAsia"/>
+      <w:rFonts w:eastAsiaTheme="majorEastAsia" w:cstheme="majorBidi"/>
       <w:i/>
       <w:iCs/>
-      <w:color w:themeColor="text1" w:themeTint="D8" w:val="272727"/>
-    </w:rPr>
-  </w:style>
-  <w:style w:styleId="Heading9" w:type="paragraph">
+      <w:color w:val="272727" w:themeColor="text1" w:themeTint="D8"/>
+    </w:rPr>
+  </w:style>
+  <w:style w:type="paragraph" w:styleId="Heading9">
     <w:name w:val="heading 9"/>
     <w:basedOn w:val="Normal"/>
     <w:next w:val="BodyText"/>
@@ -2153,24 +2180,198 @@
       <w:outlineLvl w:val="8"/>
     </w:pPr>
     <w:rPr>
-      <w:rFonts w:cstheme="majorBidi" w:eastAsiaTheme="majorEastAsia"/>
-      <w:color w:themeColor="text1" w:themeTint="D8" w:val="272727"/>
-    </w:rPr>
-  </w:style>
-  <w:style w:customStyle="1" w:styleId="Heading1Char" w:type="character">
+      <w:rFonts w:eastAsiaTheme="majorEastAsia" w:cstheme="majorBidi"/>
+      <w:color w:val="272727" w:themeColor="text1" w:themeTint="D8"/>
+    </w:rPr>
+  </w:style>
+  <w:style w:type="character" w:default="1" w:styleId="DefaultParagraphFont">
+    <w:name w:val="Default Paragraph Font"/>
+    <w:uiPriority w:val="1"/>
+    <w:semiHidden/>
+    <w:unhideWhenUsed/>
+  </w:style>
+  <w:style w:type="table" w:default="1" w:styleId="TableNormal">
+    <w:name w:val="Normal Table"/>
+    <w:uiPriority w:val="99"/>
+    <w:semiHidden/>
+    <w:unhideWhenUsed/>
+    <w:tblPr>
+      <w:tblInd w:w="0" w:type="dxa"/>
+      <w:tblCellMar>
+        <w:top w:w="0" w:type="dxa"/>
+        <w:left w:w="108" w:type="dxa"/>
+        <w:bottom w:w="0" w:type="dxa"/>
+        <w:right w:w="108" w:type="dxa"/>
+      </w:tblCellMar>
+    </w:tblPr>
+  </w:style>
+  <w:style w:type="numbering" w:default="1" w:styleId="NoList">
+    <w:name w:val="No List"/>
+    <w:uiPriority w:val="99"/>
+    <w:semiHidden/>
+    <w:unhideWhenUsed/>
+  </w:style>
+  <w:style w:type="paragraph" w:styleId="BodyText">
+    <w:name w:val="Body Text"/>
+    <w:basedOn w:val="Normal"/>
+    <w:qFormat/>
+    <w:pPr>
+      <w:spacing w:before="180" w:after="180"/>
+    </w:pPr>
+  </w:style>
+  <w:style w:type="paragraph" w:customStyle="1" w:styleId="FirstParagraph">
+    <w:name w:val="First Paragraph"/>
+    <w:basedOn w:val="BodyText"/>
+    <w:next w:val="BodyText"/>
+    <w:qFormat/>
+  </w:style>
+  <w:style w:type="paragraph" w:customStyle="1" w:styleId="Compact">
+    <w:name w:val="Compact"/>
+    <w:basedOn w:val="BodyText"/>
+    <w:qFormat/>
+    <w:pPr>
+      <w:spacing w:before="36" w:after="36"/>
+    </w:pPr>
+  </w:style>
+  <w:style w:type="paragraph" w:styleId="Title">
+    <w:name w:val="Title"/>
+    <w:basedOn w:val="Normal"/>
+    <w:next w:val="BodyText"/>
+    <w:link w:val="TitleChar"/>
+    <w:uiPriority w:val="10"/>
+    <w:qFormat/>
+    <w:rsid w:val="00A10FD9"/>
+    <w:pPr>
+      <w:spacing w:after="80"/>
+      <w:contextualSpacing/>
+      <w:jc w:val="center"/>
+    </w:pPr>
+    <w:rPr>
+      <w:rFonts w:asciiTheme="majorHAnsi" w:eastAsiaTheme="majorEastAsia" w:hAnsiTheme="majorHAnsi" w:cstheme="majorBidi"/>
+      <w:spacing w:val="-10"/>
+      <w:kern w:val="28"/>
+      <w:sz w:val="56"/>
+      <w:szCs w:val="56"/>
+    </w:rPr>
+  </w:style>
+  <w:style w:type="character" w:customStyle="1" w:styleId="TitleChar">
+    <w:name w:val="Title Char"/>
+    <w:basedOn w:val="DefaultParagraphFont"/>
+    <w:link w:val="Title"/>
+    <w:uiPriority w:val="10"/>
+    <w:rsid w:val="00A10FD9"/>
+    <w:rPr>
+      <w:rFonts w:asciiTheme="majorHAnsi" w:eastAsiaTheme="majorEastAsia" w:hAnsiTheme="majorHAnsi" w:cstheme="majorBidi"/>
+      <w:spacing w:val="-10"/>
+      <w:kern w:val="28"/>
+      <w:sz w:val="56"/>
+      <w:szCs w:val="56"/>
+    </w:rPr>
+  </w:style>
+  <w:style w:type="paragraph" w:styleId="Subtitle">
+    <w:name w:val="Subtitle"/>
+    <w:basedOn w:val="Title"/>
+    <w:next w:val="BodyText"/>
+    <w:link w:val="SubtitleChar"/>
+    <w:uiPriority w:val="11"/>
+    <w:qFormat/>
+    <w:rsid w:val="00A10FD9"/>
+    <w:pPr>
+      <w:numPr>
+        <w:ilvl w:val="1"/>
+      </w:numPr>
+    </w:pPr>
+    <w:rPr>
+      <w:spacing w:val="15"/>
+      <w:sz w:val="28"/>
+      <w:szCs w:val="28"/>
+    </w:rPr>
+  </w:style>
+  <w:style w:type="character" w:customStyle="1" w:styleId="SubtitleChar">
+    <w:name w:val="Subtitle Char"/>
+    <w:basedOn w:val="DefaultParagraphFont"/>
+    <w:link w:val="Subtitle"/>
+    <w:uiPriority w:val="11"/>
+    <w:rsid w:val="00A10FD9"/>
+    <w:rPr>
+      <w:rFonts w:eastAsiaTheme="majorEastAsia" w:cstheme="majorBidi"/>
+      <w:color w:val="595959" w:themeColor="text1" w:themeTint="A6"/>
+      <w:spacing w:val="15"/>
+      <w:sz w:val="28"/>
+      <w:szCs w:val="28"/>
+    </w:rPr>
+  </w:style>
+  <w:style w:type="paragraph" w:customStyle="1" w:styleId="Author">
+    <w:name w:val="Author"/>
+    <w:next w:val="BodyText"/>
+    <w:qFormat/>
+    <w:pPr>
+      <w:keepNext/>
+      <w:keepLines/>
+      <w:jc w:val="center"/>
+    </w:pPr>
+  </w:style>
+  <w:style w:type="paragraph" w:styleId="Date">
+    <w:name w:val="Date"/>
+    <w:next w:val="BodyText"/>
+    <w:qFormat/>
+    <w:pPr>
+      <w:keepNext/>
+      <w:keepLines/>
+      <w:jc w:val="center"/>
+    </w:pPr>
+  </w:style>
+  <w:style w:type="paragraph" w:customStyle="1" w:styleId="AbstractTitle">
+    <w:name w:val="Abstract Title"/>
+    <w:basedOn w:val="Normal"/>
+    <w:next w:val="Abstract"/>
+    <w:qFormat/>
+    <w:pPr>
+      <w:keepNext/>
+      <w:keepLines/>
+      <w:spacing w:before="300" w:after="0"/>
+      <w:jc w:val="center"/>
+    </w:pPr>
+    <w:rPr>
+      <w:b/>
+      <w:sz w:val="20"/>
+      <w:szCs w:val="20"/>
+    </w:rPr>
+  </w:style>
+  <w:style w:type="paragraph" w:customStyle="1" w:styleId="Abstract">
+    <w:name w:val="Abstract"/>
+    <w:basedOn w:val="Normal"/>
+    <w:next w:val="BodyText"/>
+    <w:qFormat/>
+    <w:pPr>
+      <w:keepNext/>
+      <w:keepLines/>
+      <w:spacing w:before="100" w:after="300"/>
+    </w:pPr>
+    <w:rPr>
+      <w:sz w:val="20"/>
+      <w:szCs w:val="20"/>
+    </w:rPr>
+  </w:style>
+  <w:style w:type="paragraph" w:styleId="Bibliography">
+    <w:name w:val="Bibliography"/>
+    <w:basedOn w:val="Normal"/>
+    <w:qFormat/>
+  </w:style>
+  <w:style w:type="character" w:customStyle="1" w:styleId="Heading1Char">
     <w:name w:val="Heading 1 Char"/>
     <w:basedOn w:val="DefaultParagraphFont"/>
     <w:link w:val="Heading1"/>
     <w:uiPriority w:val="9"/>
     <w:rsid w:val="00A10FD9"/>
     <w:rPr>
-      <w:rFonts w:asciiTheme="majorHAnsi" w:cstheme="majorBidi" w:eastAsiaTheme="majorEastAsia" w:hAnsiTheme="majorHAnsi"/>
-      <w:color w:themeColor="accent1" w:themeShade="BF" w:val="0F4761"/>
+      <w:rFonts w:asciiTheme="majorHAnsi" w:eastAsiaTheme="majorEastAsia" w:hAnsiTheme="majorHAnsi" w:cstheme="majorBidi"/>
+      <w:color w:val="0F4761" w:themeColor="accent1" w:themeShade="BF"/>
       <w:sz w:val="40"/>
       <w:szCs w:val="40"/>
     </w:rPr>
   </w:style>
-  <w:style w:customStyle="1" w:styleId="Heading2Char" w:type="character">
+  <w:style w:type="character" w:customStyle="1" w:styleId="Heading2Char">
     <w:name w:val="Heading 2 Char"/>
     <w:basedOn w:val="DefaultParagraphFont"/>
     <w:link w:val="Heading2"/>
@@ -2178,13 +2379,13 @@
     <w:semiHidden/>
     <w:rsid w:val="00A10FD9"/>
     <w:rPr>
-      <w:rFonts w:asciiTheme="majorHAnsi" w:cstheme="majorBidi" w:eastAsiaTheme="majorEastAsia" w:hAnsiTheme="majorHAnsi"/>
-      <w:color w:themeColor="accent1" w:themeShade="BF" w:val="0F4761"/>
+      <w:rFonts w:asciiTheme="majorHAnsi" w:eastAsiaTheme="majorEastAsia" w:hAnsiTheme="majorHAnsi" w:cstheme="majorBidi"/>
+      <w:color w:val="0F4761" w:themeColor="accent1" w:themeShade="BF"/>
       <w:sz w:val="32"/>
       <w:szCs w:val="32"/>
     </w:rPr>
   </w:style>
-  <w:style w:customStyle="1" w:styleId="Heading3Char" w:type="character">
+  <w:style w:type="character" w:customStyle="1" w:styleId="Heading3Char">
     <w:name w:val="Heading 3 Char"/>
     <w:basedOn w:val="DefaultParagraphFont"/>
     <w:link w:val="Heading3"/>
@@ -2192,13 +2393,13 @@
     <w:semiHidden/>
     <w:rsid w:val="00A10FD9"/>
     <w:rPr>
-      <w:rFonts w:cstheme="majorBidi" w:eastAsiaTheme="majorEastAsia"/>
-      <w:color w:themeColor="accent1" w:themeShade="BF" w:val="0F4761"/>
+      <w:rFonts w:eastAsiaTheme="majorEastAsia" w:cstheme="majorBidi"/>
+      <w:color w:val="0F4761" w:themeColor="accent1" w:themeShade="BF"/>
       <w:sz w:val="28"/>
       <w:szCs w:val="28"/>
     </w:rPr>
   </w:style>
-  <w:style w:customStyle="1" w:styleId="Heading4Char" w:type="character">
+  <w:style w:type="character" w:customStyle="1" w:styleId="Heading4Char">
     <w:name w:val="Heading 4 Char"/>
     <w:basedOn w:val="DefaultParagraphFont"/>
     <w:link w:val="Heading4"/>
@@ -2206,13 +2407,13 @@
     <w:semiHidden/>
     <w:rsid w:val="00A10FD9"/>
     <w:rPr>
-      <w:rFonts w:cstheme="majorBidi" w:eastAsiaTheme="majorEastAsia"/>
+      <w:rFonts w:eastAsiaTheme="majorEastAsia" w:cstheme="majorBidi"/>
       <w:i/>
       <w:iCs/>
-      <w:color w:themeColor="accent1" w:themeShade="BF" w:val="0F4761"/>
-    </w:rPr>
-  </w:style>
-  <w:style w:customStyle="1" w:styleId="Heading5Char" w:type="character">
+      <w:color w:val="0F4761" w:themeColor="accent1" w:themeShade="BF"/>
+    </w:rPr>
+  </w:style>
+  <w:style w:type="character" w:customStyle="1" w:styleId="Heading5Char">
     <w:name w:val="Heading 5 Char"/>
     <w:basedOn w:val="DefaultParagraphFont"/>
     <w:link w:val="Heading5"/>
@@ -2220,11 +2421,11 @@
     <w:semiHidden/>
     <w:rsid w:val="00A10FD9"/>
     <w:rPr>
-      <w:rFonts w:cstheme="majorBidi" w:eastAsiaTheme="majorEastAsia"/>
-      <w:color w:themeColor="accent1" w:themeShade="BF" w:val="0F4761"/>
-    </w:rPr>
-  </w:style>
-  <w:style w:customStyle="1" w:styleId="Heading6Char" w:type="character">
+      <w:rFonts w:eastAsiaTheme="majorEastAsia" w:cstheme="majorBidi"/>
+      <w:color w:val="0F4761" w:themeColor="accent1" w:themeShade="BF"/>
+    </w:rPr>
+  </w:style>
+  <w:style w:type="character" w:customStyle="1" w:styleId="Heading6Char">
     <w:name w:val="Heading 6 Char"/>
     <w:basedOn w:val="DefaultParagraphFont"/>
     <w:link w:val="Heading6"/>
@@ -2232,13 +2433,13 @@
     <w:semiHidden/>
     <w:rsid w:val="00A10FD9"/>
     <w:rPr>
-      <w:rFonts w:cstheme="majorBidi" w:eastAsiaTheme="majorEastAsia"/>
+      <w:rFonts w:eastAsiaTheme="majorEastAsia" w:cstheme="majorBidi"/>
       <w:i/>
       <w:iCs/>
-      <w:color w:themeColor="text1" w:themeTint="A6" w:val="595959"/>
-    </w:rPr>
-  </w:style>
-  <w:style w:customStyle="1" w:styleId="Heading7Char" w:type="character">
+      <w:color w:val="595959" w:themeColor="text1" w:themeTint="A6"/>
+    </w:rPr>
+  </w:style>
+  <w:style w:type="character" w:customStyle="1" w:styleId="Heading7Char">
     <w:name w:val="Heading 7 Char"/>
     <w:basedOn w:val="DefaultParagraphFont"/>
     <w:link w:val="Heading7"/>
@@ -2246,11 +2447,11 @@
     <w:semiHidden/>
     <w:rsid w:val="00A10FD9"/>
     <w:rPr>
-      <w:rFonts w:cstheme="majorBidi" w:eastAsiaTheme="majorEastAsia"/>
-      <w:color w:themeColor="text1" w:themeTint="A6" w:val="595959"/>
-    </w:rPr>
-  </w:style>
-  <w:style w:customStyle="1" w:styleId="Heading8Char" w:type="character">
+      <w:rFonts w:eastAsiaTheme="majorEastAsia" w:cstheme="majorBidi"/>
+      <w:color w:val="595959" w:themeColor="text1" w:themeTint="A6"/>
+    </w:rPr>
+  </w:style>
+  <w:style w:type="character" w:customStyle="1" w:styleId="Heading8Char">
     <w:name w:val="Heading 8 Char"/>
     <w:basedOn w:val="DefaultParagraphFont"/>
     <w:link w:val="Heading8"/>
@@ -2258,13 +2459,13 @@
     <w:semiHidden/>
     <w:rsid w:val="00A10FD9"/>
     <w:rPr>
-      <w:rFonts w:cstheme="majorBidi" w:eastAsiaTheme="majorEastAsia"/>
+      <w:rFonts w:eastAsiaTheme="majorEastAsia" w:cstheme="majorBidi"/>
       <w:i/>
       <w:iCs/>
-      <w:color w:themeColor="text1" w:themeTint="D8" w:val="272727"/>
-    </w:rPr>
-  </w:style>
-  <w:style w:customStyle="1" w:styleId="Heading9Char" w:type="character">
+      <w:color w:val="272727" w:themeColor="text1" w:themeTint="D8"/>
+    </w:rPr>
+  </w:style>
+  <w:style w:type="character" w:customStyle="1" w:styleId="Heading9Char">
     <w:name w:val="Heading 9 Char"/>
     <w:basedOn w:val="DefaultParagraphFont"/>
     <w:link w:val="Heading9"/>
@@ -2272,11 +2473,11 @@
     <w:semiHidden/>
     <w:rsid w:val="00A10FD9"/>
     <w:rPr>
-      <w:rFonts w:cstheme="majorBidi" w:eastAsiaTheme="majorEastAsia"/>
-      <w:color w:themeColor="text1" w:themeTint="D8" w:val="272727"/>
-    </w:rPr>
-  </w:style>
-  <w:style w:styleId="BlockText" w:type="paragraph">
+      <w:rFonts w:eastAsiaTheme="majorEastAsia" w:cstheme="majorBidi"/>
+      <w:color w:val="272727" w:themeColor="text1" w:themeTint="D8"/>
+    </w:rPr>
+  </w:style>
+  <w:style w:type="paragraph" w:styleId="BlockText">
     <w:name w:val="Block Text"/>
     <w:basedOn w:val="BodyText"/>
     <w:next w:val="BodyText"/>
@@ -2284,19 +2485,18 @@
     <w:unhideWhenUsed/>
     <w:qFormat/>
     <w:pPr>
-      <w:spacing w:after="100" w:before="100"/>
-      <w:ind w:firstLine="0" w:left="480" w:right="480"/>
+      <w:spacing w:before="100" w:after="100"/>
+      <w:ind w:left="480" w:right="480"/>
     </w:pPr>
   </w:style>
-  <w:style w:styleId="FootnoteText" w:type="paragraph">
-    <w:name w:val="Footnote Text"/>
+  <w:style w:type="paragraph" w:styleId="FootnoteText">
+    <w:name w:val="footnote text"/>
     <w:basedOn w:val="Normal"/>
-    <w:next w:val="FootnoteText"/>
     <w:uiPriority w:val="9"/>
     <w:unhideWhenUsed/>
     <w:qFormat/>
   </w:style>
-  <w:style w:styleId="FootnoteBlockText" w:type="paragraph">
+  <w:style w:type="paragraph" w:customStyle="1" w:styleId="FootnoteBlockText">
     <w:name w:val="Footnote Block Text"/>
     <w:basedOn w:val="FootnoteText"/>
     <w:next w:val="FootnoteText"/>
@@ -2304,47 +2504,40 @@
     <w:unhideWhenUsed/>
     <w:qFormat/>
     <w:pPr>
-      <w:spacing w:after="100" w:before="100"/>
-      <w:ind w:firstLine="0" w:left="480" w:right="480"/>
+      <w:spacing w:before="100" w:after="100"/>
+      <w:ind w:left="480" w:right="480"/>
     </w:pPr>
   </w:style>
-  <w:style w:default="1" w:styleId="DefaultParagraphFont" w:type="character">
-    <w:name w:val="Default Paragraph Font"/>
-    <w:semiHidden/>
-    <w:unhideWhenUsed/>
-  </w:style>
-  <w:style w:default="1" w:styleId="Table" w:type="table">
+  <w:style w:type="table" w:customStyle="1" w:styleId="Table">
     <w:name w:val="Table"/>
-    <w:basedOn w:val="TableNormal"/>
     <w:semiHidden/>
     <w:unhideWhenUsed/>
     <w:qFormat/>
     <w:tblPr>
-      <w:tblInd w:type="dxa" w:w="0"/>
+      <w:tblInd w:w="0" w:type="dxa"/>
       <w:tblCellMar>
-        <w:top w:type="dxa" w:w="0"/>
-        <w:left w:type="dxa" w:w="108"/>
-        <w:bottom w:type="dxa" w:w="0"/>
-        <w:right w:type="dxa" w:w="108"/>
+        <w:top w:w="0" w:type="dxa"/>
+        <w:left w:w="108" w:type="dxa"/>
+        <w:bottom w:w="0" w:type="dxa"/>
+        <w:right w:w="108" w:type="dxa"/>
       </w:tblCellMar>
     </w:tblPr>
     <w:tblStylePr w:type="firstRow">
       <w:tblPr>
         <w:jc w:val="left"/>
-        <w:tblInd w:type="dxa" w:w="0"/>
       </w:tblPr>
       <w:trPr>
         <w:jc w:val="left"/>
       </w:trPr>
       <w:tcPr>
         <w:tcBorders>
-          <w:bottom w:val="single"/>
+          <w:bottom w:val="single" w:sz="0" w:space="0" w:color="auto"/>
         </w:tcBorders>
         <w:vAlign w:val="bottom"/>
       </w:tcPr>
     </w:tblStylePr>
   </w:style>
-  <w:style w:customStyle="1" w:styleId="DefinitionTerm" w:type="paragraph">
+  <w:style w:type="paragraph" w:customStyle="1" w:styleId="DefinitionTerm">
     <w:name w:val="Definition Term"/>
     <w:basedOn w:val="Normal"/>
     <w:next w:val="Definition"/>
@@ -2357,75 +2550,76 @@
       <w:b/>
     </w:rPr>
   </w:style>
-  <w:style w:customStyle="1" w:styleId="Definition" w:type="paragraph">
+  <w:style w:type="paragraph" w:customStyle="1" w:styleId="Definition">
     <w:name w:val="Definition"/>
     <w:basedOn w:val="Normal"/>
   </w:style>
-  <w:style w:styleId="Caption" w:type="paragraph">
-    <w:name w:val="Caption"/>
+  <w:style w:type="paragraph" w:styleId="Caption">
+    <w:name w:val="caption"/>
     <w:basedOn w:val="Normal"/>
-    <w:link w:val="BodyTextChar"/>
+    <w:link w:val="CaptionChar"/>
     <w:pPr>
-      <w:spacing w:after="120" w:before="0"/>
+      <w:spacing w:after="120"/>
     </w:pPr>
     <w:rPr>
       <w:i/>
     </w:rPr>
   </w:style>
-  <w:style w:customStyle="1" w:styleId="TableCaption" w:type="paragraph">
+  <w:style w:type="paragraph" w:customStyle="1" w:styleId="TableCaption">
     <w:name w:val="Table Caption"/>
     <w:basedOn w:val="Caption"/>
     <w:pPr>
       <w:keepNext/>
     </w:pPr>
   </w:style>
-  <w:style w:customStyle="1" w:styleId="ImageCaption" w:type="paragraph">
+  <w:style w:type="paragraph" w:customStyle="1" w:styleId="ImageCaption">
     <w:name w:val="Image Caption"/>
     <w:basedOn w:val="Caption"/>
   </w:style>
-  <w:style w:customStyle="1" w:styleId="Figure" w:type="paragraph">
+  <w:style w:type="paragraph" w:customStyle="1" w:styleId="Figure">
     <w:name w:val="Figure"/>
     <w:basedOn w:val="Normal"/>
   </w:style>
-  <w:style w:customStyle="1" w:styleId="CaptionedFigure" w:type="paragraph">
+  <w:style w:type="paragraph" w:customStyle="1" w:styleId="CaptionedFigure">
     <w:name w:val="Captioned Figure"/>
     <w:basedOn w:val="Figure"/>
     <w:pPr>
       <w:keepNext/>
     </w:pPr>
   </w:style>
-  <w:style w:customStyle="1" w:styleId="BodyTextChar" w:type="character">
-    <w:name w:val="Body Text Char"/>
+  <w:style w:type="character" w:customStyle="1" w:styleId="CaptionChar">
+    <w:name w:val="Caption Char"/>
     <w:basedOn w:val="DefaultParagraphFont"/>
-    <w:link w:val="BodyText"/>
-  </w:style>
-  <w:style w:customStyle="1" w:styleId="VerbatimChar" w:type="character">
+    <w:link w:val="Caption"/>
+  </w:style>
+  <w:style w:type="character" w:customStyle="1" w:styleId="VerbatimChar">
     <w:name w:val="Verbatim Char"/>
-    <w:basedOn w:val="BodyTextChar"/>
+    <w:basedOn w:val="CaptionChar"/>
+    <w:link w:val="SourceCode"/>
     <w:rPr>
       <w:rFonts w:ascii="Consolas" w:hAnsi="Consolas"/>
       <w:sz w:val="22"/>
     </w:rPr>
   </w:style>
-  <w:style w:customStyle="1" w:styleId="SectionNumber" w:type="character">
+  <w:style w:type="character" w:customStyle="1" w:styleId="SectionNumber">
     <w:name w:val="Section Number"/>
-    <w:basedOn w:val="BodyTextChar"/>
-  </w:style>
-  <w:style w:styleId="FootnoteReference" w:type="character">
-    <w:name w:val="Footnote Reference"/>
-    <w:basedOn w:val="BodyTextChar"/>
+    <w:basedOn w:val="CaptionChar"/>
+  </w:style>
+  <w:style w:type="character" w:styleId="FootnoteReference">
+    <w:name w:val="footnote reference"/>
+    <w:basedOn w:val="CaptionChar"/>
     <w:rPr>
       <w:vertAlign w:val="superscript"/>
     </w:rPr>
   </w:style>
-  <w:style w:styleId="Hyperlink" w:type="character">
+  <w:style w:type="character" w:styleId="Hyperlink">
     <w:name w:val="Hyperlink"/>
-    <w:basedOn w:val="BodyTextChar"/>
-    <w:rPr>
-      <w:color w:themeColor="accent1" w:val="4F81BD"/>
-    </w:rPr>
-  </w:style>
-  <w:style w:styleId="TOCHeading" w:type="paragraph">
+    <w:basedOn w:val="CaptionChar"/>
+    <w:rPr>
+      <w:color w:val="156082" w:themeColor="accent1"/>
+    </w:rPr>
+  </w:style>
+  <w:style w:type="paragraph" w:styleId="TOCHeading">
     <w:name w:val="TOC Heading"/>
     <w:basedOn w:val="Heading1"/>
     <w:next w:val="BodyText"/>
@@ -2436,246 +2630,305 @@
       <w:spacing w:before="240" w:line="259" w:lineRule="auto"/>
       <w:outlineLvl w:val="9"/>
     </w:pPr>
-    <w:rPr>
-      <w:rFonts w:asciiTheme="majorHAnsi" w:cstheme="majorBidi" w:eastAsiaTheme="majorEastAsia" w:hAnsiTheme="majorHAnsi"/>
-      <w:b w:val="0"/>
-      <w:bCs w:val="0"/>
-      <w:color w:themeColor="accent1" w:themeShade="BF" w:val="365F91"/>
-    </w:rPr>
   </w:style>
   <w:style w:type="paragraph" w:customStyle="1" w:styleId="SourceCode">
     <w:name w:val="Source Code"/>
     <w:basedOn w:val="Normal"/>
     <w:link w:val="VerbatimChar"/>
     <w:pPr>
-      <w:wordWrap w:val="off"/>
+      <w:wordWrap w:val="0"/>
     </w:pPr>
   </w:style>
   <w:style w:type="character" w:customStyle="1" w:styleId="KeywordTok">
     <w:name w:val="KeywordTok"/>
     <w:basedOn w:val="VerbatimChar"/>
     <w:rPr>
+      <w:rFonts w:ascii="Consolas" w:hAnsi="Consolas"/>
       <w:b/>
       <w:color w:val="007020"/>
+      <w:sz w:val="22"/>
     </w:rPr>
   </w:style>
   <w:style w:type="character" w:customStyle="1" w:styleId="DataTypeTok">
     <w:name w:val="DataTypeTok"/>
     <w:basedOn w:val="VerbatimChar"/>
     <w:rPr>
+      <w:rFonts w:ascii="Consolas" w:hAnsi="Consolas"/>
       <w:color w:val="902000"/>
+      <w:sz w:val="22"/>
     </w:rPr>
   </w:style>
   <w:style w:type="character" w:customStyle="1" w:styleId="DecValTok">
     <w:name w:val="DecValTok"/>
     <w:basedOn w:val="VerbatimChar"/>
     <w:rPr>
-      <w:color w:val="40a070"/>
+      <w:rFonts w:ascii="Consolas" w:hAnsi="Consolas"/>
+      <w:color w:val="40A070"/>
+      <w:sz w:val="22"/>
     </w:rPr>
   </w:style>
   <w:style w:type="character" w:customStyle="1" w:styleId="BaseNTok">
     <w:name w:val="BaseNTok"/>
     <w:basedOn w:val="VerbatimChar"/>
     <w:rPr>
-      <w:color w:val="40a070"/>
+      <w:rFonts w:ascii="Consolas" w:hAnsi="Consolas"/>
+      <w:color w:val="40A070"/>
+      <w:sz w:val="22"/>
     </w:rPr>
   </w:style>
   <w:style w:type="character" w:customStyle="1" w:styleId="FloatTok">
     <w:name w:val="FloatTok"/>
     <w:basedOn w:val="VerbatimChar"/>
     <w:rPr>
-      <w:color w:val="40a070"/>
+      <w:rFonts w:ascii="Consolas" w:hAnsi="Consolas"/>
+      <w:color w:val="40A070"/>
+      <w:sz w:val="22"/>
     </w:rPr>
   </w:style>
   <w:style w:type="character" w:customStyle="1" w:styleId="ConstantTok">
     <w:name w:val="ConstantTok"/>
     <w:basedOn w:val="VerbatimChar"/>
     <w:rPr>
+      <w:rFonts w:ascii="Consolas" w:hAnsi="Consolas"/>
       <w:color w:val="880000"/>
+      <w:sz w:val="22"/>
     </w:rPr>
   </w:style>
   <w:style w:type="character" w:customStyle="1" w:styleId="CharTok">
     <w:name w:val="CharTok"/>
     <w:basedOn w:val="VerbatimChar"/>
     <w:rPr>
-      <w:color w:val="4070a0"/>
+      <w:rFonts w:ascii="Consolas" w:hAnsi="Consolas"/>
+      <w:color w:val="4070A0"/>
+      <w:sz w:val="22"/>
     </w:rPr>
   </w:style>
   <w:style w:type="character" w:customStyle="1" w:styleId="SpecialCharTok">
     <w:name w:val="SpecialCharTok"/>
     <w:basedOn w:val="VerbatimChar"/>
     <w:rPr>
-      <w:color w:val="4070a0"/>
+      <w:rFonts w:ascii="Consolas" w:hAnsi="Consolas"/>
+      <w:color w:val="4070A0"/>
+      <w:sz w:val="22"/>
     </w:rPr>
   </w:style>
   <w:style w:type="character" w:customStyle="1" w:styleId="StringTok">
     <w:name w:val="StringTok"/>
     <w:basedOn w:val="VerbatimChar"/>
     <w:rPr>
-      <w:color w:val="4070a0"/>
+      <w:rFonts w:ascii="Consolas" w:hAnsi="Consolas"/>
+      <w:color w:val="4070A0"/>
+      <w:sz w:val="22"/>
     </w:rPr>
   </w:style>
   <w:style w:type="character" w:customStyle="1" w:styleId="VerbatimStringTok">
     <w:name w:val="VerbatimStringTok"/>
     <w:basedOn w:val="VerbatimChar"/>
     <w:rPr>
-      <w:color w:val="4070a0"/>
+      <w:rFonts w:ascii="Consolas" w:hAnsi="Consolas"/>
+      <w:color w:val="4070A0"/>
+      <w:sz w:val="22"/>
     </w:rPr>
   </w:style>
   <w:style w:type="character" w:customStyle="1" w:styleId="SpecialStringTok">
     <w:name w:val="SpecialStringTok"/>
     <w:basedOn w:val="VerbatimChar"/>
     <w:rPr>
-      <w:color w:val="bb6688"/>
+      <w:rFonts w:ascii="Consolas" w:hAnsi="Consolas"/>
+      <w:color w:val="BB6688"/>
+      <w:sz w:val="22"/>
     </w:rPr>
   </w:style>
   <w:style w:type="character" w:customStyle="1" w:styleId="ImportTok">
     <w:name w:val="ImportTok"/>
     <w:basedOn w:val="VerbatimChar"/>
     <w:rPr>
+      <w:rFonts w:ascii="Consolas" w:hAnsi="Consolas"/>
       <w:b/>
       <w:color w:val="008000"/>
+      <w:sz w:val="22"/>
     </w:rPr>
   </w:style>
   <w:style w:type="character" w:customStyle="1" w:styleId="CommentTok">
     <w:name w:val="CommentTok"/>
     <w:basedOn w:val="VerbatimChar"/>
     <w:rPr>
+      <w:rFonts w:ascii="Consolas" w:hAnsi="Consolas"/>
       <w:i/>
-      <w:color w:val="60a0b0"/>
+      <w:color w:val="60A0B0"/>
+      <w:sz w:val="22"/>
     </w:rPr>
   </w:style>
   <w:style w:type="character" w:customStyle="1" w:styleId="DocumentationTok">
     <w:name w:val="DocumentationTok"/>
     <w:basedOn w:val="VerbatimChar"/>
     <w:rPr>
+      <w:rFonts w:ascii="Consolas" w:hAnsi="Consolas"/>
       <w:i/>
-      <w:color w:val="ba2121"/>
+      <w:color w:val="BA2121"/>
+      <w:sz w:val="22"/>
     </w:rPr>
   </w:style>
   <w:style w:type="character" w:customStyle="1" w:styleId="AnnotationTok">
     <w:name w:val="AnnotationTok"/>
     <w:basedOn w:val="VerbatimChar"/>
     <w:rPr>
+      <w:rFonts w:ascii="Consolas" w:hAnsi="Consolas"/>
       <w:b/>
       <w:i/>
-      <w:color w:val="60a0b0"/>
+      <w:color w:val="60A0B0"/>
+      <w:sz w:val="22"/>
     </w:rPr>
   </w:style>
   <w:style w:type="character" w:customStyle="1" w:styleId="CommentVarTok">
     <w:name w:val="CommentVarTok"/>
     <w:basedOn w:val="VerbatimChar"/>
     <w:rPr>
+      <w:rFonts w:ascii="Consolas" w:hAnsi="Consolas"/>
       <w:b/>
       <w:i/>
-      <w:color w:val="60a0b0"/>
+      <w:color w:val="60A0B0"/>
+      <w:sz w:val="22"/>
     </w:rPr>
   </w:style>
   <w:style w:type="character" w:customStyle="1" w:styleId="OtherTok">
     <w:name w:val="OtherTok"/>
     <w:basedOn w:val="VerbatimChar"/>
     <w:rPr>
+      <w:rFonts w:ascii="Consolas" w:hAnsi="Consolas"/>
       <w:color w:val="007020"/>
+      <w:sz w:val="22"/>
     </w:rPr>
   </w:style>
   <w:style w:type="character" w:customStyle="1" w:styleId="FunctionTok">
     <w:name w:val="FunctionTok"/>
     <w:basedOn w:val="VerbatimChar"/>
     <w:rPr>
-      <w:color w:val="06287e"/>
+      <w:rFonts w:ascii="Consolas" w:hAnsi="Consolas"/>
+      <w:color w:val="06287E"/>
+      <w:sz w:val="22"/>
     </w:rPr>
   </w:style>
   <w:style w:type="character" w:customStyle="1" w:styleId="VariableTok">
     <w:name w:val="VariableTok"/>
     <w:basedOn w:val="VerbatimChar"/>
     <w:rPr>
-      <w:color w:val="19177c"/>
+      <w:rFonts w:ascii="Consolas" w:hAnsi="Consolas"/>
+      <w:color w:val="19177C"/>
+      <w:sz w:val="22"/>
     </w:rPr>
   </w:style>
   <w:style w:type="character" w:customStyle="1" w:styleId="ControlFlowTok">
     <w:name w:val="ControlFlowTok"/>
     <w:basedOn w:val="VerbatimChar"/>
     <w:rPr>
+      <w:rFonts w:ascii="Consolas" w:hAnsi="Consolas"/>
       <w:b/>
       <w:color w:val="007020"/>
+      <w:sz w:val="22"/>
     </w:rPr>
   </w:style>
   <w:style w:type="character" w:customStyle="1" w:styleId="OperatorTok">
     <w:name w:val="OperatorTok"/>
     <w:basedOn w:val="VerbatimChar"/>
     <w:rPr>
+      <w:rFonts w:ascii="Consolas" w:hAnsi="Consolas"/>
       <w:color w:val="666666"/>
+      <w:sz w:val="22"/>
     </w:rPr>
   </w:style>
   <w:style w:type="character" w:customStyle="1" w:styleId="BuiltInTok">
     <w:name w:val="BuiltInTok"/>
     <w:basedOn w:val="VerbatimChar"/>
     <w:rPr>
+      <w:rFonts w:ascii="Consolas" w:hAnsi="Consolas"/>
       <w:color w:val="008000"/>
+      <w:sz w:val="22"/>
     </w:rPr>
   </w:style>
   <w:style w:type="character" w:customStyle="1" w:styleId="ExtensionTok">
     <w:name w:val="ExtensionTok"/>
     <w:basedOn w:val="VerbatimChar"/>
-    <w:rPr/>
+    <w:rPr>
+      <w:rFonts w:ascii="Consolas" w:hAnsi="Consolas"/>
+      <w:sz w:val="22"/>
+    </w:rPr>
   </w:style>
   <w:style w:type="character" w:customStyle="1" w:styleId="PreprocessorTok">
     <w:name w:val="PreprocessorTok"/>
     <w:basedOn w:val="VerbatimChar"/>
     <w:rPr>
-      <w:color w:val="bc7a00"/>
+      <w:rFonts w:ascii="Consolas" w:hAnsi="Consolas"/>
+      <w:color w:val="BC7A00"/>
+      <w:sz w:val="22"/>
     </w:rPr>
   </w:style>
   <w:style w:type="character" w:customStyle="1" w:styleId="AttributeTok">
     <w:name w:val="AttributeTok"/>
     <w:basedOn w:val="VerbatimChar"/>
     <w:rPr>
-      <w:color w:val="7d9029"/>
+      <w:rFonts w:ascii="Consolas" w:hAnsi="Consolas"/>
+      <w:color w:val="7D9029"/>
+      <w:sz w:val="22"/>
     </w:rPr>
   </w:style>
   <w:style w:type="character" w:customStyle="1" w:styleId="RegionMarkerTok">
     <w:name w:val="RegionMarkerTok"/>
     <w:basedOn w:val="VerbatimChar"/>
-    <w:rPr/>
+    <w:rPr>
+      <w:rFonts w:ascii="Consolas" w:hAnsi="Consolas"/>
+      <w:sz w:val="22"/>
+    </w:rPr>
   </w:style>
   <w:style w:type="character" w:customStyle="1" w:styleId="InformationTok">
     <w:name w:val="InformationTok"/>
     <w:basedOn w:val="VerbatimChar"/>
     <w:rPr>
+      <w:rFonts w:ascii="Consolas" w:hAnsi="Consolas"/>
       <w:b/>
       <w:i/>
-      <w:color w:val="60a0b0"/>
+      <w:color w:val="60A0B0"/>
+      <w:sz w:val="22"/>
     </w:rPr>
   </w:style>
   <w:style w:type="character" w:customStyle="1" w:styleId="WarningTok">
     <w:name w:val="WarningTok"/>
     <w:basedOn w:val="VerbatimChar"/>
     <w:rPr>
+      <w:rFonts w:ascii="Consolas" w:hAnsi="Consolas"/>
       <w:b/>
       <w:i/>
-      <w:color w:val="60a0b0"/>
+      <w:color w:val="60A0B0"/>
+      <w:sz w:val="22"/>
     </w:rPr>
   </w:style>
   <w:style w:type="character" w:customStyle="1" w:styleId="AlertTok">
     <w:name w:val="AlertTok"/>
     <w:basedOn w:val="VerbatimChar"/>
     <w:rPr>
+      <w:rFonts w:ascii="Consolas" w:hAnsi="Consolas"/>
       <w:b/>
-      <w:color w:val="ff0000"/>
+      <w:color w:val="FF0000"/>
+      <w:sz w:val="22"/>
     </w:rPr>
   </w:style>
   <w:style w:type="character" w:customStyle="1" w:styleId="ErrorTok">
     <w:name w:val="ErrorTok"/>
     <w:basedOn w:val="VerbatimChar"/>
     <w:rPr>
+      <w:rFonts w:ascii="Consolas" w:hAnsi="Consolas"/>
       <w:b/>
-      <w:color w:val="ff0000"/>
+      <w:color w:val="FF0000"/>
+      <w:sz w:val="22"/>
     </w:rPr>
   </w:style>
   <w:style w:type="character" w:customStyle="1" w:styleId="NormalTok">
     <w:name w:val="NormalTok"/>
     <w:basedOn w:val="VerbatimChar"/>
-    <w:rPr/>
+    <w:rPr>
+      <w:rFonts w:ascii="Consolas" w:hAnsi="Consolas"/>
+      <w:sz w:val="22"/>
+    </w:rPr>
   </w:style>
 </w:styles>
 </file>

</xml_diff>